<commit_message>
Final ATS resume for Waters 1021 - all corrections applied
</commit_message>
<xml_diff>
--- a/Naveen_Kumar_KM_Resume_1021_FINAL.docx
+++ b/Naveen_Kumar_KM_Resume_1021_FINAL.docx
@@ -72,7 +72,7 @@
           <w:color w:val="333333"/>
           <w:sz w:val="19"/>
         </w:rPr>
-        <w:t>Computer Science Engineering student (CGPA: 8.32) with hands-on experience in Python, SQL, machine learning, and data-driven problem solving. Completed 7 months of AI/ML internship training covering model development, data analysis, and deployment workflows. Experienced in project coordination, team collaboration, and documentation through hackathons and leadership roles. Exploring Generative AI concepts including LLMs and embeddings. Maintains 70+ public GitHub repositories with CI/CD workflows. Seeking an internship to apply data analysis, ML, and project coordination skills in a professional environment.</w:t>
+        <w:t>Computer Science Engineering student with hands-on experience in Python, SQL, machine learning, and data-driven problem solving. Completed 7 months of AI/ML internship training covering model development, data analysis, and deployment workflows. Experienced in project coordination, team collaboration, and documentation through 10+ hackathons and leadership roles. Exploring Generative AI concepts including LLMs and embeddings. Maintains 70+ public GitHub repositories with CI/CD workflows. Seeking an internship to apply data analysis, ML, and project coordination skills in a professional environment.</w:t>
       </w:r>
     </w:p>
     <w:p>
@@ -133,7 +133,7 @@
           <w:color w:val="333333"/>
           <w:sz w:val="19"/>
         </w:rPr>
-        <w:t>scikit-learn, Classification, Regression, Clustering, Model Evaluation (Confusion Matrix, Precision, Recall, F1-Score), Data Preprocessing, Feature Engineering</w:t>
+        <w:t>scikit-learn, Classification, Regression, Clustering, NLP (Text Classification), Model Evaluation (Confusion Matrix, Precision, Recall, F1-Score), Data Preprocessing, Feature Engineering</w:t>
       </w:r>
     </w:p>
     <w:p>
@@ -624,7 +624,7 @@
           <w:b/>
           <w:sz w:val="20"/>
         </w:rPr>
-        <w:t>Kerala Krishi Sahayak - Data-Driven Farming Assistant</w:t>
+        <w:t>Spam Email Classification - NLP &amp; ML Text Classification</w:t>
       </w:r>
       <w:r>
         <w:rPr>
@@ -633,7 +633,7 @@
           <w:color w:val="555555"/>
           <w:sz w:val="18"/>
         </w:rPr>
-        <w:t xml:space="preserve">  |  Flutter, Dart, Data Integration, State Management</w:t>
+        <w:t xml:space="preserve">  |  Python, scikit-learn, NLP, Pandas, NumPy</w:t>
       </w:r>
     </w:p>
     <w:p>
@@ -647,7 +647,7 @@
           <w:color w:val="333333"/>
           <w:sz w:val="19"/>
         </w:rPr>
-        <w:t>- Consolidated data from 8 government agricultural schemes into a unified platform for data-driven decision support.</w:t>
+        <w:t>- Built ML classification model for spam email detection using natural language processing and text feature extraction.</w:t>
       </w:r>
     </w:p>
     <w:p>
@@ -661,7 +661,7 @@
           <w:color w:val="333333"/>
           <w:sz w:val="19"/>
         </w:rPr>
-        <w:t>- Improved farmer adoption rate by 12% through simplified data access and user-friendly information organization.</w:t>
+        <w:t>- Implemented text preprocessing pipeline including tokenization, vectorization, and feature engineering on email datasets.</w:t>
       </w:r>
     </w:p>
     <w:p>
@@ -675,7 +675,7 @@
           <w:color w:val="333333"/>
           <w:sz w:val="19"/>
         </w:rPr>
-        <w:t>- Implemented offline data persistence to ensure continuous access to critical agricultural insights.</w:t>
+        <w:t>- Trained and evaluated multiple ML classifiers to identify optimal model with high precision and recall scores.</w:t>
       </w:r>
     </w:p>
     <w:p>
@@ -689,7 +689,7 @@
           <w:color w:val="333333"/>
           <w:sz w:val="19"/>
         </w:rPr>
-        <w:t>- Live: sih-nhce.vercel.app | GitHub: github.com/Naveenkm07/kerala-krishi-sahayak-flutter</w:t>
+        <w:t>- GitHub: github.com/Naveenkm07/spam-email-classification</w:t>
       </w:r>
     </w:p>
     <w:p>
@@ -732,7 +732,7 @@
           <w:color w:val="555555"/>
           <w:sz w:val="19"/>
         </w:rPr>
-        <w:t>New Horizon College of Engineering, Bengaluru | 2024-2027 | CGPA: 8.32</w:t>
+        <w:t>New Horizon College of Engineering, Bengaluru | 2024-2027 | CGPA: 8.56</w:t>
       </w:r>
     </w:p>
     <w:p>
@@ -857,7 +857,7 @@
           <w:color w:val="333333"/>
           <w:sz w:val="19"/>
         </w:rPr>
-        <w:t>- Participated in 5+ national-level hackathons, consistently leading project planning, documentation, and team communication.</w:t>
+        <w:t>- Participated in 10+ national-level hackathons, consistently leading project planning, documentation, and team communication.</w:t>
       </w:r>
     </w:p>
     <w:p>
@@ -888,7 +888,49 @@
           <w:color w:val="333333"/>
           <w:sz w:val="19"/>
         </w:rPr>
-        <w:t>- Data Structures &amp; Algorithms Course - GeeksforGeeks</w:t>
+        <w:t>- Building Intelligent Agents with Generative AI - New Horizon College of Engineering (Oct 2025)</w:t>
+      </w:r>
+    </w:p>
+    <w:p>
+      <w:pPr>
+        <w:spacing w:after="10"/>
+        <w:ind w:left="360"/>
+      </w:pPr>
+      <w:r>
+        <w:rPr>
+          <w:rFonts w:ascii="Calibri" w:hAnsi="Calibri"/>
+          <w:color w:val="333333"/>
+          <w:sz w:val="19"/>
+        </w:rPr>
+        <w:t>- Hands-on with Azure Cloud &amp; AI Fundamentals - New Horizon College of Engineering (Oct 2025)</w:t>
+      </w:r>
+    </w:p>
+    <w:p>
+      <w:pPr>
+        <w:spacing w:after="10"/>
+        <w:ind w:left="360"/>
+      </w:pPr>
+      <w:r>
+        <w:rPr>
+          <w:rFonts w:ascii="Calibri" w:hAnsi="Calibri"/>
+          <w:color w:val="333333"/>
+          <w:sz w:val="19"/>
+        </w:rPr>
+        <w:t>- AI For All - Intel (Jul 2025)</w:t>
+      </w:r>
+    </w:p>
+    <w:p>
+      <w:pPr>
+        <w:spacing w:after="10"/>
+        <w:ind w:left="360"/>
+      </w:pPr>
+      <w:r>
+        <w:rPr>
+          <w:rFonts w:ascii="Calibri" w:hAnsi="Calibri"/>
+          <w:color w:val="333333"/>
+          <w:sz w:val="19"/>
+        </w:rPr>
+        <w:t>- Gen AI Powered Data Analytics Job Simulation - Forage (Jul 2025)</w:t>
       </w:r>
     </w:p>
     <w:p>
@@ -917,6 +959,34 @@
           <w:sz w:val="19"/>
         </w:rPr>
         <w:t>- AI/ML Internship Completion Certificate - Ember Quest</w:t>
+      </w:r>
+    </w:p>
+    <w:p>
+      <w:pPr>
+        <w:spacing w:after="10"/>
+        <w:ind w:left="360"/>
+      </w:pPr>
+      <w:r>
+        <w:rPr>
+          <w:rFonts w:ascii="Calibri" w:hAnsi="Calibri"/>
+          <w:color w:val="333333"/>
+          <w:sz w:val="19"/>
+        </w:rPr>
+        <w:t>- J.P. Morgan Software Engineering Job Simulation - Forage (Aug 2025)</w:t>
+      </w:r>
+    </w:p>
+    <w:p>
+      <w:pPr>
+        <w:spacing w:after="10"/>
+        <w:ind w:left="360"/>
+      </w:pPr>
+      <w:r>
+        <w:rPr>
+          <w:rFonts w:ascii="Calibri" w:hAnsi="Calibri"/>
+          <w:color w:val="333333"/>
+          <w:sz w:val="19"/>
+        </w:rPr>
+        <w:t>- AWS Solutions Architecture Job Simulation - Forage (Aug 2025)</w:t>
       </w:r>
     </w:p>
     <w:sectPr>

</xml_diff>

<commit_message>
Final 1-page ATS resume with clickable links and all corrections
</commit_message>
<xml_diff>
--- a/Naveen_Kumar_KM_Resume_1021_FINAL.docx
+++ b/Naveen_Kumar_KM_Resume_1021_FINAL.docx
@@ -12,21 +12,21 @@
           <w:rFonts w:ascii="Calibri" w:hAnsi="Calibri"/>
           <w:b/>
           <w:color w:val="1A1A1A"/>
-          <w:sz w:val="36"/>
+          <w:sz w:val="32"/>
         </w:rPr>
         <w:t>NAVEEN KUMAR K M</w:t>
       </w:r>
     </w:p>
     <w:p>
       <w:pPr>
-        <w:spacing w:after="20"/>
+        <w:spacing w:after="10"/>
         <w:jc w:val="center"/>
       </w:pPr>
       <w:r>
         <w:rPr>
           <w:rFonts w:ascii="Calibri" w:hAnsi="Calibri"/>
           <w:color w:val="444444"/>
-          <w:sz w:val="19"/>
+          <w:sz w:val="18"/>
         </w:rPr>
         <w:t>+91 9591502209 | kmnaveenkm85@gmail.com</w:t>
       </w:r>
@@ -40,16 +40,68 @@
         <w:rPr>
           <w:rFonts w:ascii="Calibri" w:hAnsi="Calibri"/>
           <w:color w:val="444444"/>
-          <w:sz w:val="19"/>
+          <w:sz w:val="18"/>
         </w:rPr>
-        <w:t>LinkedIn: linkedin.com/in/naveenkm07 | GitHub: github.com/Naveenkm07 | Portfolio: naveenkm07.netlify.app</w:t>
+        <w:t xml:space="preserve">LinkedIn: </w:t>
       </w:r>
+      <w:hyperlink r:id="rId9">
+        <w:r>
+          <w:rPr>
+            <w:rStyle w:val="Hyperlink"/>
+            <w:sz w:val="19"/>
+            <w:rFonts w:ascii="Calibri" w:hAnsi="Calibri"/>
+            <w:color w:val="444444"/>
+            <w:u w:val="none"/>
+          </w:rPr>
+          <w:t>linkedin.com/in/naveenkm07</w:t>
+        </w:r>
+      </w:hyperlink>
+      <w:r>
+        <w:rPr>
+          <w:rFonts w:ascii="Calibri" w:hAnsi="Calibri"/>
+          <w:color w:val="444444"/>
+          <w:sz w:val="18"/>
+        </w:rPr>
+        <w:t xml:space="preserve"> | GitHub: </w:t>
+      </w:r>
+      <w:hyperlink r:id="rId10">
+        <w:r>
+          <w:rPr>
+            <w:rStyle w:val="Hyperlink"/>
+            <w:sz w:val="19"/>
+            <w:rFonts w:ascii="Calibri" w:hAnsi="Calibri"/>
+            <w:color w:val="444444"/>
+            <w:u w:val="none"/>
+          </w:rPr>
+          <w:t>github.com/Naveenkm07</w:t>
+        </w:r>
+      </w:hyperlink>
+      <w:r>
+        <w:rPr>
+          <w:rFonts w:ascii="Calibri" w:hAnsi="Calibri"/>
+          <w:color w:val="444444"/>
+          <w:sz w:val="18"/>
+        </w:rPr>
+        <w:t xml:space="preserve"> | Portfolio: </w:t>
+      </w:r>
+      <w:hyperlink r:id="rId11">
+        <w:r>
+          <w:rPr>
+            <w:rStyle w:val="Hyperlink"/>
+            <w:sz w:val="19"/>
+            <w:rFonts w:ascii="Calibri" w:hAnsi="Calibri"/>
+            <w:color w:val="444444"/>
+            <w:u w:val="none"/>
+          </w:rPr>
+          <w:t>naveenkm07.netlify.app</w:t>
+        </w:r>
+      </w:hyperlink>
     </w:p>
     <w:p>
       <w:pPr>
-        <w:spacing w:before="160" w:after="40"/>
+        <w:spacing w:before="120" w:after="30"/>
         <w:pBdr>
-          <w:bottom w:val="single" w:sz="6" w:space="1" w:color="2a2a2a"/>
+          <w:bottom w:val="single" w:sz="4" w:space="1" w:color="333333"/>
         </w:pBdr>
       </w:pPr>
       <w:r>
@@ -57,669 +109,9 @@
           <w:rFonts w:ascii="Calibri" w:hAnsi="Calibri"/>
           <w:b/>
           <w:color w:val="1A1A1A"/>
-          <w:sz w:val="23"/>
+          <w:sz w:val="21"/>
         </w:rPr>
         <w:t>PROFESSIONAL SUMMARY</w:t>
-      </w:r>
-    </w:p>
-    <w:p>
-      <w:pPr>
-        <w:spacing w:after="60"/>
-      </w:pPr>
-      <w:r>
-        <w:rPr>
-          <w:rFonts w:ascii="Calibri" w:hAnsi="Calibri"/>
-          <w:color w:val="333333"/>
-          <w:sz w:val="19"/>
-        </w:rPr>
-        <w:t>Computer Science Engineering student with hands-on experience in Python, SQL, machine learning, and data-driven problem solving. Completed 7 months of AI/ML internship training covering model development, data analysis, and deployment workflows. Experienced in project coordination, team collaboration, and documentation through 10+ hackathons and leadership roles. Exploring Generative AI concepts including LLMs and embeddings. Maintains 70+ public GitHub repositories with CI/CD workflows. Seeking an internship to apply data analysis, ML, and project coordination skills in a professional environment.</w:t>
-      </w:r>
-    </w:p>
-    <w:p>
-      <w:pPr>
-        <w:spacing w:before="160" w:after="40"/>
-        <w:pBdr>
-          <w:bottom w:val="single" w:sz="6" w:space="1" w:color="2a2a2a"/>
-        </w:pBdr>
-      </w:pPr>
-      <w:r>
-        <w:rPr>
-          <w:rFonts w:ascii="Calibri" w:hAnsi="Calibri"/>
-          <w:b/>
-          <w:color w:val="1A1A1A"/>
-          <w:sz w:val="23"/>
-        </w:rPr>
-        <w:t>TECHNICAL SKILLS</w:t>
-      </w:r>
-    </w:p>
-    <w:p>
-      <w:pPr>
-        <w:spacing w:after="10"/>
-        <w:ind w:left="216"/>
-      </w:pPr>
-      <w:r>
-        <w:rPr>
-          <w:rFonts w:ascii="Calibri" w:hAnsi="Calibri"/>
-          <w:b/>
-          <w:sz w:val="19"/>
-        </w:rPr>
-        <w:t xml:space="preserve">Programming &amp; Data: </w:t>
-      </w:r>
-      <w:r>
-        <w:rPr>
-          <w:rFonts w:ascii="Calibri" w:hAnsi="Calibri"/>
-          <w:color w:val="333333"/>
-          <w:sz w:val="19"/>
-        </w:rPr>
-        <w:t>Python, SQL, C, C++, Pandas, NumPy</w:t>
-      </w:r>
-    </w:p>
-    <w:p>
-      <w:pPr>
-        <w:spacing w:after="10"/>
-        <w:ind w:left="216"/>
-      </w:pPr>
-      <w:r>
-        <w:rPr>
-          <w:rFonts w:ascii="Calibri" w:hAnsi="Calibri"/>
-          <w:b/>
-          <w:sz w:val="19"/>
-        </w:rPr>
-        <w:t xml:space="preserve">Machine Learning: </w:t>
-      </w:r>
-      <w:r>
-        <w:rPr>
-          <w:rFonts w:ascii="Calibri" w:hAnsi="Calibri"/>
-          <w:color w:val="333333"/>
-          <w:sz w:val="19"/>
-        </w:rPr>
-        <w:t>scikit-learn, Classification, Regression, Clustering, NLP (Text Classification), Model Evaluation (Confusion Matrix, Precision, Recall, F1-Score), Data Preprocessing, Feature Engineering</w:t>
-      </w:r>
-    </w:p>
-    <w:p>
-      <w:pPr>
-        <w:spacing w:after="10"/>
-        <w:ind w:left="216"/>
-      </w:pPr>
-      <w:r>
-        <w:rPr>
-          <w:rFonts w:ascii="Calibri" w:hAnsi="Calibri"/>
-          <w:b/>
-          <w:sz w:val="19"/>
-        </w:rPr>
-        <w:t xml:space="preserve">AI Interests: </w:t>
-      </w:r>
-      <w:r>
-        <w:rPr>
-          <w:rFonts w:ascii="Calibri" w:hAnsi="Calibri"/>
-          <w:color w:val="333333"/>
-          <w:sz w:val="19"/>
-        </w:rPr>
-        <w:t>Exploring Generative AI (LLMs, Embeddings, Vector Stores), Agentic AI Concepts</w:t>
-      </w:r>
-    </w:p>
-    <w:p>
-      <w:pPr>
-        <w:spacing w:after="10"/>
-        <w:ind w:left="216"/>
-      </w:pPr>
-      <w:r>
-        <w:rPr>
-          <w:rFonts w:ascii="Calibri" w:hAnsi="Calibri"/>
-          <w:b/>
-          <w:sz w:val="19"/>
-        </w:rPr>
-        <w:t xml:space="preserve">Data &amp; Databases: </w:t>
-      </w:r>
-      <w:r>
-        <w:rPr>
-          <w:rFonts w:ascii="Calibri" w:hAnsi="Calibri"/>
-          <w:color w:val="333333"/>
-          <w:sz w:val="19"/>
-        </w:rPr>
-        <w:t>MySQL, MongoDB, SQLite, Data Analysis, Data Visualization, Matplotlib</w:t>
-      </w:r>
-    </w:p>
-    <w:p>
-      <w:pPr>
-        <w:spacing w:after="10"/>
-        <w:ind w:left="216"/>
-      </w:pPr>
-      <w:r>
-        <w:rPr>
-          <w:rFonts w:ascii="Calibri" w:hAnsi="Calibri"/>
-          <w:b/>
-          <w:sz w:val="19"/>
-        </w:rPr>
-        <w:t xml:space="preserve">Version Control &amp; CI/CD: </w:t>
-      </w:r>
-      <w:r>
-        <w:rPr>
-          <w:rFonts w:ascii="Calibri" w:hAnsi="Calibri"/>
-          <w:color w:val="333333"/>
-          <w:sz w:val="19"/>
-        </w:rPr>
-        <w:t>Git, GitHub, CI/CD Pipelines, Docker, Jenkins</w:t>
-      </w:r>
-    </w:p>
-    <w:p>
-      <w:pPr>
-        <w:spacing w:after="10"/>
-        <w:ind w:left="216"/>
-      </w:pPr>
-      <w:r>
-        <w:rPr>
-          <w:rFonts w:ascii="Calibri" w:hAnsi="Calibri"/>
-          <w:b/>
-          <w:sz w:val="19"/>
-        </w:rPr>
-        <w:t xml:space="preserve">Cloud Platforms: </w:t>
-      </w:r>
-      <w:r>
-        <w:rPr>
-          <w:rFonts w:ascii="Calibri" w:hAnsi="Calibri"/>
-          <w:color w:val="333333"/>
-          <w:sz w:val="19"/>
-        </w:rPr>
-        <w:t>AWS (Basic), Azure (Basic), GCP (Basic)</w:t>
-      </w:r>
-    </w:p>
-    <w:p>
-      <w:pPr>
-        <w:spacing w:after="10"/>
-        <w:ind w:left="216"/>
-      </w:pPr>
-      <w:r>
-        <w:rPr>
-          <w:rFonts w:ascii="Calibri" w:hAnsi="Calibri"/>
-          <w:b/>
-          <w:sz w:val="19"/>
-        </w:rPr>
-        <w:t xml:space="preserve">Project &amp; Agile: </w:t>
-      </w:r>
-      <w:r>
-        <w:rPr>
-          <w:rFonts w:ascii="Calibri" w:hAnsi="Calibri"/>
-          <w:color w:val="333333"/>
-          <w:sz w:val="19"/>
-        </w:rPr>
-        <w:t>Agile Methodology, SDLC, Project Documentation, Team Coordination, Stakeholder Communication</w:t>
-      </w:r>
-    </w:p>
-    <w:p>
-      <w:pPr>
-        <w:spacing w:after="10"/>
-        <w:ind w:left="216"/>
-      </w:pPr>
-      <w:r>
-        <w:rPr>
-          <w:rFonts w:ascii="Calibri" w:hAnsi="Calibri"/>
-          <w:b/>
-          <w:sz w:val="19"/>
-        </w:rPr>
-        <w:t xml:space="preserve">Other Tools: </w:t>
-      </w:r>
-      <w:r>
-        <w:rPr>
-          <w:rFonts w:ascii="Calibri" w:hAnsi="Calibri"/>
-          <w:color w:val="333333"/>
-          <w:sz w:val="19"/>
-        </w:rPr>
-        <w:t>Postman, Selenium, pytest, REST API Testing, Flask, HTML, CSS, JavaScript</w:t>
-      </w:r>
-    </w:p>
-    <w:p>
-      <w:pPr>
-        <w:spacing w:before="160" w:after="40"/>
-        <w:pBdr>
-          <w:bottom w:val="single" w:sz="6" w:space="1" w:color="2a2a2a"/>
-        </w:pBdr>
-      </w:pPr>
-      <w:r>
-        <w:rPr>
-          <w:rFonts w:ascii="Calibri" w:hAnsi="Calibri"/>
-          <w:b/>
-          <w:color w:val="1A1A1A"/>
-          <w:sz w:val="23"/>
-        </w:rPr>
-        <w:t>PROFESSIONAL EXPERIENCE</w:t>
-      </w:r>
-    </w:p>
-    <w:p>
-      <w:pPr>
-        <w:spacing w:after="10" w:before="60"/>
-      </w:pPr>
-      <w:r>
-        <w:rPr>
-          <w:rFonts w:ascii="Calibri" w:hAnsi="Calibri"/>
-          <w:b/>
-          <w:sz w:val="20"/>
-        </w:rPr>
-        <w:t>AI/ML Intern - Ember Quest</w:t>
-      </w:r>
-      <w:r>
-        <w:rPr>
-          <w:rFonts w:ascii="Calibri" w:hAnsi="Calibri"/>
-          <w:i/>
-          <w:color w:val="555555"/>
-          <w:sz w:val="19"/>
-        </w:rPr>
-        <w:t xml:space="preserve">  |  4 Months</w:t>
-      </w:r>
-    </w:p>
-    <w:p>
-      <w:pPr>
-        <w:spacing w:after="10"/>
-        <w:ind w:left="360"/>
-      </w:pPr>
-      <w:r>
-        <w:rPr>
-          <w:rFonts w:ascii="Calibri" w:hAnsi="Calibri"/>
-          <w:color w:val="333333"/>
-          <w:sz w:val="19"/>
-        </w:rPr>
-        <w:t>- Built and evaluated ML models for classification and regression tasks using Python and scikit-learn on real-world datasets.</w:t>
-      </w:r>
-    </w:p>
-    <w:p>
-      <w:pPr>
-        <w:spacing w:after="10"/>
-        <w:ind w:left="360"/>
-      </w:pPr>
-      <w:r>
-        <w:rPr>
-          <w:rFonts w:ascii="Calibri" w:hAnsi="Calibri"/>
-          <w:color w:val="333333"/>
-          <w:sz w:val="19"/>
-        </w:rPr>
-        <w:t>- Performed data preprocessing, feature engineering, and exploratory data analysis to prepare datasets for model training.</w:t>
-      </w:r>
-    </w:p>
-    <w:p>
-      <w:pPr>
-        <w:spacing w:after="10"/>
-        <w:ind w:left="360"/>
-      </w:pPr>
-      <w:r>
-        <w:rPr>
-          <w:rFonts w:ascii="Calibri" w:hAnsi="Calibri"/>
-          <w:color w:val="333333"/>
-          <w:sz w:val="19"/>
-        </w:rPr>
-        <w:t>- Supported model experimentation and structured workflow tracking in an Agile development environment.</w:t>
-      </w:r>
-    </w:p>
-    <w:p>
-      <w:pPr>
-        <w:spacing w:after="10"/>
-        <w:ind w:left="360"/>
-      </w:pPr>
-      <w:r>
-        <w:rPr>
-          <w:rFonts w:ascii="Calibri" w:hAnsi="Calibri"/>
-          <w:color w:val="333333"/>
-          <w:sz w:val="19"/>
-        </w:rPr>
-        <w:t>- Documented findings, presented results to team leads, and collaborated with cross-functional team members for iterative improvements.</w:t>
-      </w:r>
-    </w:p>
-    <w:p>
-      <w:pPr>
-        <w:spacing w:after="10" w:before="60"/>
-      </w:pPr>
-      <w:r>
-        <w:rPr>
-          <w:rFonts w:ascii="Calibri" w:hAnsi="Calibri"/>
-          <w:b/>
-          <w:sz w:val="20"/>
-        </w:rPr>
-        <w:t>AI/ML Industry Trainee - Crystallize Technologies</w:t>
-      </w:r>
-      <w:r>
-        <w:rPr>
-          <w:rFonts w:ascii="Calibri" w:hAnsi="Calibri"/>
-          <w:i/>
-          <w:color w:val="555555"/>
-          <w:sz w:val="19"/>
-        </w:rPr>
-        <w:t xml:space="preserve">  |  3 Months</w:t>
-      </w:r>
-    </w:p>
-    <w:p>
-      <w:pPr>
-        <w:spacing w:after="10"/>
-        <w:ind w:left="360"/>
-      </w:pPr>
-      <w:r>
-        <w:rPr>
-          <w:rFonts w:ascii="Calibri" w:hAnsi="Calibri"/>
-          <w:color w:val="333333"/>
-          <w:sz w:val="19"/>
-        </w:rPr>
-        <w:t>- Completed advanced training in machine learning, deep learning concepts, and model optimization techniques.</w:t>
-      </w:r>
-    </w:p>
-    <w:p>
-      <w:pPr>
-        <w:spacing w:after="10"/>
-        <w:ind w:left="360"/>
-      </w:pPr>
-      <w:r>
-        <w:rPr>
-          <w:rFonts w:ascii="Calibri" w:hAnsi="Calibri"/>
-          <w:color w:val="333333"/>
-          <w:sz w:val="19"/>
-        </w:rPr>
-        <w:t>- Worked on industry-relevant ML projects involving data cleaning, transformation, and evaluation workflows.</w:t>
-      </w:r>
-    </w:p>
-    <w:p>
-      <w:pPr>
-        <w:spacing w:after="10"/>
-        <w:ind w:left="360"/>
-      </w:pPr>
-      <w:r>
-        <w:rPr>
-          <w:rFonts w:ascii="Calibri" w:hAnsi="Calibri"/>
-          <w:color w:val="333333"/>
-          <w:sz w:val="19"/>
-        </w:rPr>
-        <w:t>- Documented project progress and delivered presentations on project outcomes to mentors and stakeholders.</w:t>
-      </w:r>
-    </w:p>
-    <w:p>
-      <w:pPr>
-        <w:spacing w:before="160" w:after="40"/>
-        <w:pBdr>
-          <w:bottom w:val="single" w:sz="6" w:space="1" w:color="2a2a2a"/>
-        </w:pBdr>
-      </w:pPr>
-      <w:r>
-        <w:rPr>
-          <w:rFonts w:ascii="Calibri" w:hAnsi="Calibri"/>
-          <w:b/>
-          <w:color w:val="1A1A1A"/>
-          <w:sz w:val="23"/>
-        </w:rPr>
-        <w:t>PROJECTS</w:t>
-      </w:r>
-    </w:p>
-    <w:p>
-      <w:pPr>
-        <w:spacing w:after="10" w:before="60"/>
-      </w:pPr>
-      <w:r>
-        <w:rPr>
-          <w:rFonts w:ascii="Calibri" w:hAnsi="Calibri"/>
-          <w:b/>
-          <w:sz w:val="20"/>
-        </w:rPr>
-        <w:t>Soil Fertility Analysis - ML Classification &amp; Decision Support</w:t>
-      </w:r>
-      <w:r>
-        <w:rPr>
-          <w:rFonts w:ascii="Calibri" w:hAnsi="Calibri"/>
-          <w:i/>
-          <w:color w:val="555555"/>
-          <w:sz w:val="18"/>
-        </w:rPr>
-        <w:t xml:space="preserve">  |  Python, Pandas, NumPy, scikit-learn, Matplotlib</w:t>
-      </w:r>
-    </w:p>
-    <w:p>
-      <w:pPr>
-        <w:spacing w:after="10"/>
-        <w:ind w:left="360"/>
-      </w:pPr>
-      <w:r>
-        <w:rPr>
-          <w:rFonts w:ascii="Calibri" w:hAnsi="Calibri"/>
-          <w:color w:val="333333"/>
-          <w:sz w:val="19"/>
-        </w:rPr>
-        <w:t>- Built ML classification model to predict soil fertility using N, P, K, and pH values with 90%+ accuracy.</w:t>
-      </w:r>
-    </w:p>
-    <w:p>
-      <w:pPr>
-        <w:spacing w:after="10"/>
-        <w:ind w:left="360"/>
-      </w:pPr>
-      <w:r>
-        <w:rPr>
-          <w:rFonts w:ascii="Calibri" w:hAnsi="Calibri"/>
-          <w:color w:val="333333"/>
-          <w:sz w:val="19"/>
-        </w:rPr>
-        <w:t>- Performed data preprocessing, feature scaling, and exploratory data analysis on agricultural datasets.</w:t>
-      </w:r>
-    </w:p>
-    <w:p>
-      <w:pPr>
-        <w:spacing w:after="10"/>
-        <w:ind w:left="360"/>
-      </w:pPr>
-      <w:r>
-        <w:rPr>
-          <w:rFonts w:ascii="Calibri" w:hAnsi="Calibri"/>
-          <w:color w:val="333333"/>
-          <w:sz w:val="19"/>
-        </w:rPr>
-        <w:t>- Implemented model evaluation metrics (confusion matrix, precision, recall, F1-score) to assess and improve accuracy.</w:t>
-      </w:r>
-    </w:p>
-    <w:p>
-      <w:pPr>
-        <w:spacing w:after="10"/>
-        <w:ind w:left="360"/>
-      </w:pPr>
-      <w:r>
-        <w:rPr>
-          <w:rFonts w:ascii="Calibri" w:hAnsi="Calibri"/>
-          <w:color w:val="333333"/>
-          <w:sz w:val="19"/>
-        </w:rPr>
-        <w:t>- Generated data-driven crop and fertilizer recommendations to support farming decision-making.</w:t>
-      </w:r>
-    </w:p>
-    <w:p>
-      <w:pPr>
-        <w:spacing w:after="10"/>
-        <w:ind w:left="360"/>
-      </w:pPr>
-      <w:r>
-        <w:rPr>
-          <w:rFonts w:ascii="Calibri" w:hAnsi="Calibri"/>
-          <w:color w:val="333333"/>
-          <w:sz w:val="19"/>
-        </w:rPr>
-        <w:t>- GitHub: github.com/Naveenkm07/Soil-Fertilisation-Analyzer-07</w:t>
-      </w:r>
-    </w:p>
-    <w:p>
-      <w:pPr>
-        <w:spacing w:after="10" w:before="60"/>
-      </w:pPr>
-      <w:r>
-        <w:rPr>
-          <w:rFonts w:ascii="Calibri" w:hAnsi="Calibri"/>
-          <w:b/>
-          <w:sz w:val="20"/>
-        </w:rPr>
-        <w:t>SecureVault - Data Management &amp; Analytics-Ready System</w:t>
-      </w:r>
-      <w:r>
-        <w:rPr>
-          <w:rFonts w:ascii="Calibri" w:hAnsi="Calibri"/>
-          <w:i/>
-          <w:color w:val="555555"/>
-          <w:sz w:val="18"/>
-        </w:rPr>
-        <w:t xml:space="preserve">  |  Python, SQL, SQLite/MySQL, Flask, AES Encryption</w:t>
-      </w:r>
-    </w:p>
-    <w:p>
-      <w:pPr>
-        <w:spacing w:after="10"/>
-        <w:ind w:left="360"/>
-      </w:pPr>
-      <w:r>
-        <w:rPr>
-          <w:rFonts w:ascii="Calibri" w:hAnsi="Calibri"/>
-          <w:color w:val="333333"/>
-          <w:sz w:val="19"/>
-        </w:rPr>
-        <w:t>- Developed structured data management system with Python backend and SQL database for secure data storage and retrieval.</w:t>
-      </w:r>
-    </w:p>
-    <w:p>
-      <w:pPr>
-        <w:spacing w:after="10"/>
-        <w:ind w:left="360"/>
-      </w:pPr>
-      <w:r>
-        <w:rPr>
-          <w:rFonts w:ascii="Calibri" w:hAnsi="Calibri"/>
-          <w:color w:val="333333"/>
-          <w:sz w:val="19"/>
-        </w:rPr>
-        <w:t>- Optimized SQL database queries to improve data retrieval efficiency by 40%, enabling faster analytics workflows.</w:t>
-      </w:r>
-    </w:p>
-    <w:p>
-      <w:pPr>
-        <w:spacing w:after="10"/>
-        <w:ind w:left="360"/>
-      </w:pPr>
-      <w:r>
-        <w:rPr>
-          <w:rFonts w:ascii="Calibri" w:hAnsi="Calibri"/>
-          <w:color w:val="333333"/>
-          <w:sz w:val="19"/>
-        </w:rPr>
-        <w:t>- Implemented role-based access control and AES-256 encryption for data security compliance.</w:t>
-      </w:r>
-    </w:p>
-    <w:p>
-      <w:pPr>
-        <w:spacing w:after="10"/>
-        <w:ind w:left="360"/>
-      </w:pPr>
-      <w:r>
-        <w:rPr>
-          <w:rFonts w:ascii="Calibri" w:hAnsi="Calibri"/>
-          <w:color w:val="333333"/>
-          <w:sz w:val="19"/>
-        </w:rPr>
-        <w:t>- Live: cse-tau.vercel.app | GitHub: github.com/Naveenkm07/PersonalDataManager-ADV</w:t>
-      </w:r>
-    </w:p>
-    <w:p>
-      <w:pPr>
-        <w:spacing w:after="10" w:before="60"/>
-      </w:pPr>
-      <w:r>
-        <w:rPr>
-          <w:rFonts w:ascii="Calibri" w:hAnsi="Calibri"/>
-          <w:b/>
-          <w:sz w:val="20"/>
-        </w:rPr>
-        <w:t>Spam Email Classification - NLP &amp; ML Text Classification</w:t>
-      </w:r>
-      <w:r>
-        <w:rPr>
-          <w:rFonts w:ascii="Calibri" w:hAnsi="Calibri"/>
-          <w:i/>
-          <w:color w:val="555555"/>
-          <w:sz w:val="18"/>
-        </w:rPr>
-        <w:t xml:space="preserve">  |  Python, scikit-learn, NLP, Pandas, NumPy</w:t>
-      </w:r>
-    </w:p>
-    <w:p>
-      <w:pPr>
-        <w:spacing w:after="10"/>
-        <w:ind w:left="360"/>
-      </w:pPr>
-      <w:r>
-        <w:rPr>
-          <w:rFonts w:ascii="Calibri" w:hAnsi="Calibri"/>
-          <w:color w:val="333333"/>
-          <w:sz w:val="19"/>
-        </w:rPr>
-        <w:t>- Built ML classification model for spam email detection using natural language processing and text feature extraction.</w:t>
-      </w:r>
-    </w:p>
-    <w:p>
-      <w:pPr>
-        <w:spacing w:after="10"/>
-        <w:ind w:left="360"/>
-      </w:pPr>
-      <w:r>
-        <w:rPr>
-          <w:rFonts w:ascii="Calibri" w:hAnsi="Calibri"/>
-          <w:color w:val="333333"/>
-          <w:sz w:val="19"/>
-        </w:rPr>
-        <w:t>- Implemented text preprocessing pipeline including tokenization, vectorization, and feature engineering on email datasets.</w:t>
-      </w:r>
-    </w:p>
-    <w:p>
-      <w:pPr>
-        <w:spacing w:after="10"/>
-        <w:ind w:left="360"/>
-      </w:pPr>
-      <w:r>
-        <w:rPr>
-          <w:rFonts w:ascii="Calibri" w:hAnsi="Calibri"/>
-          <w:color w:val="333333"/>
-          <w:sz w:val="19"/>
-        </w:rPr>
-        <w:t>- Trained and evaluated multiple ML classifiers to identify optimal model with high precision and recall scores.</w:t>
-      </w:r>
-    </w:p>
-    <w:p>
-      <w:pPr>
-        <w:spacing w:after="10"/>
-        <w:ind w:left="360"/>
-      </w:pPr>
-      <w:r>
-        <w:rPr>
-          <w:rFonts w:ascii="Calibri" w:hAnsi="Calibri"/>
-          <w:color w:val="333333"/>
-          <w:sz w:val="19"/>
-        </w:rPr>
-        <w:t>- GitHub: github.com/Naveenkm07/spam-email-classification</w:t>
-      </w:r>
-    </w:p>
-    <w:p>
-      <w:pPr>
-        <w:spacing w:before="160" w:after="40"/>
-        <w:pBdr>
-          <w:bottom w:val="single" w:sz="6" w:space="1" w:color="2a2a2a"/>
-        </w:pBdr>
-      </w:pPr>
-      <w:r>
-        <w:rPr>
-          <w:rFonts w:ascii="Calibri" w:hAnsi="Calibri"/>
-          <w:b/>
-          <w:color w:val="1A1A1A"/>
-          <w:sz w:val="23"/>
-        </w:rPr>
-        <w:t>EDUCATION</w:t>
-      </w:r>
-    </w:p>
-    <w:p>
-      <w:pPr>
-        <w:spacing w:after="0" w:before="40"/>
-      </w:pPr>
-      <w:r>
-        <w:rPr>
-          <w:rFonts w:ascii="Calibri" w:hAnsi="Calibri"/>
-          <w:b/>
-          <w:sz w:val="20"/>
-        </w:rPr>
-        <w:t>Bachelor of Engineering in Computer Science (CSE)</w:t>
       </w:r>
     </w:p>
     <w:p>
@@ -729,69 +121,17 @@
       <w:r>
         <w:rPr>
           <w:rFonts w:ascii="Calibri" w:hAnsi="Calibri"/>
-          <w:color w:val="555555"/>
-          <w:sz w:val="19"/>
+          <w:color w:val="333333"/>
+          <w:sz w:val="18"/>
         </w:rPr>
-        <w:t>New Horizon College of Engineering, Bengaluru | 2024-2027 | CGPA: 8.56</w:t>
+        <w:t>CSE student with 7 months of AI/ML internship experience in Python, SQL, and scikit-learn. Built and deployed ML models for classification, data analysis, and prediction tasks. Familiar with Agile workflows, Git-based collaboration, and project documentation. Currently exploring Generative AI and LLM concepts. Active open-source contributor with 70+ GitHub repositories. Won 2nd place at Srujana 2025 Hackathon.</w:t>
       </w:r>
     </w:p>
     <w:p>
       <w:pPr>
-        <w:spacing w:after="0" w:before="40"/>
-      </w:pPr>
-      <w:r>
-        <w:rPr>
-          <w:rFonts w:ascii="Calibri" w:hAnsi="Calibri"/>
-          <w:b/>
-          <w:sz w:val="20"/>
-        </w:rPr>
-        <w:t>Diploma in Computer Science</w:t>
-      </w:r>
-    </w:p>
-    <w:p>
-      <w:pPr>
-        <w:spacing w:after="20"/>
-      </w:pPr>
-      <w:r>
-        <w:rPr>
-          <w:rFonts w:ascii="Calibri" w:hAnsi="Calibri"/>
-          <w:color w:val="555555"/>
-          <w:sz w:val="19"/>
-        </w:rPr>
-        <w:t>SJM Polytechnic, Chitradurga | 2021-2024 | 82.12%</w:t>
-      </w:r>
-    </w:p>
-    <w:p>
-      <w:pPr>
-        <w:spacing w:after="0" w:before="40"/>
-      </w:pPr>
-      <w:r>
-        <w:rPr>
-          <w:rFonts w:ascii="Calibri" w:hAnsi="Calibri"/>
-          <w:b/>
-          <w:sz w:val="20"/>
-        </w:rPr>
-        <w:t>SSLC</w:t>
-      </w:r>
-    </w:p>
-    <w:p>
-      <w:pPr>
-        <w:spacing w:after="20"/>
-      </w:pPr>
-      <w:r>
-        <w:rPr>
-          <w:rFonts w:ascii="Calibri" w:hAnsi="Calibri"/>
-          <w:color w:val="555555"/>
-          <w:sz w:val="19"/>
-        </w:rPr>
-        <w:t>SJM Residential School, Chitradurga | 2020-2021 | 93.12%</w:t>
-      </w:r>
-    </w:p>
-    <w:p>
-      <w:pPr>
-        <w:spacing w:before="160" w:after="40"/>
+        <w:spacing w:before="120" w:after="30"/>
         <w:pBdr>
-          <w:bottom w:val="single" w:sz="6" w:space="1" w:color="2a2a2a"/>
+          <w:bottom w:val="single" w:sz="4" w:space="1" w:color="333333"/>
         </w:pBdr>
       </w:pPr>
       <w:r>
@@ -799,72 +139,163 @@
           <w:rFonts w:ascii="Calibri" w:hAnsi="Calibri"/>
           <w:b/>
           <w:color w:val="1A1A1A"/>
-          <w:sz w:val="23"/>
+          <w:sz w:val="21"/>
         </w:rPr>
-        <w:t>LEADERSHIP &amp; COORDINATION</w:t>
+        <w:t>TECHNICAL SKILLS</w:t>
       </w:r>
     </w:p>
     <w:p>
       <w:pPr>
-        <w:spacing w:after="10"/>
-        <w:ind w:left="360"/>
+        <w:spacing w:after="6"/>
       </w:pPr>
       <w:r>
         <w:rPr>
           <w:rFonts w:ascii="Calibri" w:hAnsi="Calibri"/>
+          <w:b/>
+          <w:sz w:val="18"/>
+        </w:rPr>
+        <w:t xml:space="preserve">Programming: </w:t>
+      </w:r>
+      <w:r>
+        <w:rPr>
+          <w:rFonts w:ascii="Calibri" w:hAnsi="Calibri"/>
           <w:color w:val="333333"/>
-          <w:sz w:val="19"/>
+          <w:sz w:val="18"/>
         </w:rPr>
-        <w:t>- TEDx NHCE Board Member (2025-2026) - Coordinated event planning, stakeholder communication, and team activities across departments.</w:t>
+        <w:t>Python, SQL, C, C++, Pandas, NumPy, Matplotlib</w:t>
       </w:r>
     </w:p>
     <w:p>
       <w:pPr>
-        <w:spacing w:after="10"/>
-        <w:ind w:left="360"/>
+        <w:spacing w:after="6"/>
       </w:pPr>
       <w:r>
         <w:rPr>
           <w:rFonts w:ascii="Calibri" w:hAnsi="Calibri"/>
+          <w:b/>
+          <w:sz w:val="18"/>
+        </w:rPr>
+        <w:t xml:space="preserve">ML &amp; AI: </w:t>
+      </w:r>
+      <w:r>
+        <w:rPr>
+          <w:rFonts w:ascii="Calibri" w:hAnsi="Calibri"/>
           <w:color w:val="333333"/>
-          <w:sz w:val="19"/>
+          <w:sz w:val="18"/>
         </w:rPr>
-        <w:t>- Srujana 2025 Hackathon - 2nd Place Winner (Chanakya University). Coordinated with team members, planned deliverables, and presented solutions to judges under tight timelines.</w:t>
+        <w:t>scikit-learn, Classification, Regression, Clustering, NLP, Data Preprocessing, Model Evaluation</w:t>
       </w:r>
     </w:p>
     <w:p>
       <w:pPr>
-        <w:spacing w:after="10"/>
-        <w:ind w:left="360"/>
+        <w:spacing w:after="6"/>
       </w:pPr>
       <w:r>
         <w:rPr>
           <w:rFonts w:ascii="Calibri" w:hAnsi="Calibri"/>
+          <w:b/>
+          <w:sz w:val="18"/>
+        </w:rPr>
+        <w:t xml:space="preserve">Exploring: </w:t>
+      </w:r>
+      <w:r>
+        <w:rPr>
+          <w:rFonts w:ascii="Calibri" w:hAnsi="Calibri"/>
           <w:color w:val="333333"/>
-          <w:sz w:val="19"/>
+          <w:sz w:val="18"/>
         </w:rPr>
-        <w:t>- Code4EDTech Hackathon 2025 - Led team in developing ML-powered education solutions in a 24-hour national-level challenge. Managed task distribution and progress tracking.</w:t>
+        <w:t>Generative AI (LLMs, Embeddings, Vector Stores), Agentic AI Concepts</w:t>
       </w:r>
     </w:p>
     <w:p>
       <w:pPr>
-        <w:spacing w:after="10"/>
-        <w:ind w:left="360"/>
+        <w:spacing w:after="6"/>
       </w:pPr>
       <w:r>
         <w:rPr>
           <w:rFonts w:ascii="Calibri" w:hAnsi="Calibri"/>
+          <w:b/>
+          <w:sz w:val="18"/>
+        </w:rPr>
+        <w:t xml:space="preserve">Databases: </w:t>
+      </w:r>
+      <w:r>
+        <w:rPr>
+          <w:rFonts w:ascii="Calibri" w:hAnsi="Calibri"/>
           <w:color w:val="333333"/>
-          <w:sz w:val="19"/>
+          <w:sz w:val="18"/>
         </w:rPr>
-        <w:t>- Participated in 10+ national-level hackathons, consistently leading project planning, documentation, and team communication.</w:t>
+        <w:t>MySQL, MongoDB, SQLite</w:t>
       </w:r>
     </w:p>
     <w:p>
       <w:pPr>
-        <w:spacing w:before="160" w:after="40"/>
+        <w:spacing w:after="6"/>
+      </w:pPr>
+      <w:r>
+        <w:rPr>
+          <w:rFonts w:ascii="Calibri" w:hAnsi="Calibri"/>
+          <w:b/>
+          <w:sz w:val="18"/>
+        </w:rPr>
+        <w:t xml:space="preserve">Tools &amp; CI/CD: </w:t>
+      </w:r>
+      <w:r>
+        <w:rPr>
+          <w:rFonts w:ascii="Calibri" w:hAnsi="Calibri"/>
+          <w:color w:val="333333"/>
+          <w:sz w:val="18"/>
+        </w:rPr>
+        <w:t>Git, GitHub, Docker, Jenkins, CI/CD, Postman, Selenium, Flask</w:t>
+      </w:r>
+    </w:p>
+    <w:p>
+      <w:pPr>
+        <w:spacing w:after="6"/>
+      </w:pPr>
+      <w:r>
+        <w:rPr>
+          <w:rFonts w:ascii="Calibri" w:hAnsi="Calibri"/>
+          <w:b/>
+          <w:sz w:val="18"/>
+        </w:rPr>
+        <w:t xml:space="preserve">Cloud: </w:t>
+      </w:r>
+      <w:r>
+        <w:rPr>
+          <w:rFonts w:ascii="Calibri" w:hAnsi="Calibri"/>
+          <w:color w:val="333333"/>
+          <w:sz w:val="18"/>
+        </w:rPr>
+        <w:t>AWS, Azure, GCP (Basic)</w:t>
+      </w:r>
+    </w:p>
+    <w:p>
+      <w:pPr>
+        <w:spacing w:after="6"/>
+      </w:pPr>
+      <w:r>
+        <w:rPr>
+          <w:rFonts w:ascii="Calibri" w:hAnsi="Calibri"/>
+          <w:b/>
+          <w:sz w:val="18"/>
+        </w:rPr>
+        <w:t xml:space="preserve">Soft Skills: </w:t>
+      </w:r>
+      <w:r>
+        <w:rPr>
+          <w:rFonts w:ascii="Calibri" w:hAnsi="Calibri"/>
+          <w:color w:val="333333"/>
+          <w:sz w:val="18"/>
+        </w:rPr>
+        <w:t>Agile, SDLC, Project Documentation, Team Coordination, Stakeholder Communication</w:t>
+      </w:r>
+    </w:p>
+    <w:p>
+      <w:pPr>
+        <w:spacing w:before="120" w:after="30"/>
         <w:pBdr>
-          <w:bottom w:val="single" w:sz="6" w:space="1" w:color="2a2a2a"/>
+          <w:bottom w:val="single" w:sz="4" w:space="1" w:color="333333"/>
         </w:pBdr>
       </w:pPr>
       <w:r>
@@ -872,126 +303,563 @@
           <w:rFonts w:ascii="Calibri" w:hAnsi="Calibri"/>
           <w:b/>
           <w:color w:val="1A1A1A"/>
-          <w:sz w:val="23"/>
+          <w:sz w:val="21"/>
+        </w:rPr>
+        <w:t>PROFESSIONAL EXPERIENCE</w:t>
+      </w:r>
+    </w:p>
+    <w:p>
+      <w:pPr>
+        <w:spacing w:after="6" w:before="40"/>
+      </w:pPr>
+      <w:r>
+        <w:rPr>
+          <w:rFonts w:ascii="Calibri" w:hAnsi="Calibri"/>
+          <w:b/>
+          <w:sz w:val="19"/>
+        </w:rPr>
+        <w:t>AI/ML Intern - Ember Quest</w:t>
+      </w:r>
+      <w:r>
+        <w:rPr>
+          <w:rFonts w:ascii="Calibri" w:hAnsi="Calibri"/>
+          <w:i/>
+          <w:color w:val="555555"/>
+          <w:sz w:val="18"/>
+        </w:rPr>
+        <w:t xml:space="preserve">  |  4 Months</w:t>
+      </w:r>
+    </w:p>
+    <w:p>
+      <w:pPr>
+        <w:spacing w:after="6"/>
+        <w:ind w:left="288"/>
+      </w:pPr>
+      <w:r>
+        <w:rPr>
+          <w:rFonts w:ascii="Calibri" w:hAnsi="Calibri"/>
+          <w:color w:val="333333"/>
+          <w:sz w:val="18"/>
+        </w:rPr>
+        <w:t>- Trained and tested ML models (classification, regression) on real datasets using Python and scikit-learn.</w:t>
+      </w:r>
+    </w:p>
+    <w:p>
+      <w:pPr>
+        <w:spacing w:after="6"/>
+        <w:ind w:left="288"/>
+      </w:pPr>
+      <w:r>
+        <w:rPr>
+          <w:rFonts w:ascii="Calibri" w:hAnsi="Calibri"/>
+          <w:color w:val="333333"/>
+          <w:sz w:val="18"/>
+        </w:rPr>
+        <w:t>- Handled data preprocessing, feature engineering, and model evaluation in Agile sprints.</w:t>
+      </w:r>
+    </w:p>
+    <w:p>
+      <w:pPr>
+        <w:spacing w:after="6"/>
+        <w:ind w:left="288"/>
+      </w:pPr>
+      <w:r>
+        <w:rPr>
+          <w:rFonts w:ascii="Calibri" w:hAnsi="Calibri"/>
+          <w:color w:val="333333"/>
+          <w:sz w:val="18"/>
+        </w:rPr>
+        <w:t>- Documented results and presented findings to team leads for iterative improvements.</w:t>
+      </w:r>
+    </w:p>
+    <w:p>
+      <w:pPr>
+        <w:spacing w:after="6" w:before="40"/>
+      </w:pPr>
+      <w:r>
+        <w:rPr>
+          <w:rFonts w:ascii="Calibri" w:hAnsi="Calibri"/>
+          <w:b/>
+          <w:sz w:val="19"/>
+        </w:rPr>
+        <w:t>AI/ML Industry Trainee - Crystallize Technologies</w:t>
+      </w:r>
+      <w:r>
+        <w:rPr>
+          <w:rFonts w:ascii="Calibri" w:hAnsi="Calibri"/>
+          <w:i/>
+          <w:color w:val="555555"/>
+          <w:sz w:val="18"/>
+        </w:rPr>
+        <w:t xml:space="preserve">  |  3 Months</w:t>
+      </w:r>
+    </w:p>
+    <w:p>
+      <w:pPr>
+        <w:spacing w:after="6"/>
+        <w:ind w:left="288"/>
+      </w:pPr>
+      <w:r>
+        <w:rPr>
+          <w:rFonts w:ascii="Calibri" w:hAnsi="Calibri"/>
+          <w:color w:val="333333"/>
+          <w:sz w:val="18"/>
+        </w:rPr>
+        <w:t>- Completed hands-on training in ML, deep learning, and model optimization.</w:t>
+      </w:r>
+    </w:p>
+    <w:p>
+      <w:pPr>
+        <w:spacing w:after="6"/>
+        <w:ind w:left="288"/>
+      </w:pPr>
+      <w:r>
+        <w:rPr>
+          <w:rFonts w:ascii="Calibri" w:hAnsi="Calibri"/>
+          <w:color w:val="333333"/>
+          <w:sz w:val="18"/>
+        </w:rPr>
+        <w:t>- Delivered project presentations on ML outcomes to mentors and peers.</w:t>
+      </w:r>
+    </w:p>
+    <w:p>
+      <w:pPr>
+        <w:spacing w:before="120" w:after="30"/>
+        <w:pBdr>
+          <w:bottom w:val="single" w:sz="4" w:space="1" w:color="333333"/>
+        </w:pBdr>
+      </w:pPr>
+      <w:r>
+        <w:rPr>
+          <w:rFonts w:ascii="Calibri" w:hAnsi="Calibri"/>
+          <w:b/>
+          <w:color w:val="1A1A1A"/>
+          <w:sz w:val="21"/>
+        </w:rPr>
+        <w:t>PROJECTS</w:t>
+      </w:r>
+    </w:p>
+    <w:p>
+      <w:pPr>
+        <w:spacing w:after="6" w:before="40"/>
+      </w:pPr>
+      <w:r>
+        <w:rPr>
+          <w:rFonts w:ascii="Calibri" w:hAnsi="Calibri"/>
+          <w:b/>
+          <w:sz w:val="19"/>
+        </w:rPr>
+        <w:t>Soil Fertility Analyzer</w:t>
+      </w:r>
+      <w:r>
+        <w:rPr>
+          <w:rFonts w:ascii="Calibri" w:hAnsi="Calibri"/>
+          <w:i/>
+          <w:color w:val="555555"/>
+          <w:sz w:val="17"/>
+        </w:rPr>
+        <w:t xml:space="preserve">  |  Python, scikit-learn, Pandas, Matplotlib</w:t>
+      </w:r>
+    </w:p>
+    <w:p>
+      <w:pPr>
+        <w:spacing w:after="6"/>
+        <w:ind w:left="288"/>
+      </w:pPr>
+      <w:r>
+        <w:rPr>
+          <w:rFonts w:ascii="Calibri" w:hAnsi="Calibri"/>
+          <w:color w:val="333333"/>
+          <w:sz w:val="18"/>
+        </w:rPr>
+        <w:t>- ML classification model predicting soil fertility from N, P, K, pH values with 90%+ accuracy.</w:t>
+      </w:r>
+    </w:p>
+    <w:p>
+      <w:pPr>
+        <w:spacing w:after="6"/>
+        <w:ind w:left="288"/>
+      </w:pPr>
+      <w:r>
+        <w:rPr>
+          <w:rFonts w:ascii="Calibri" w:hAnsi="Calibri"/>
+          <w:color w:val="333333"/>
+          <w:sz w:val="18"/>
+        </w:rPr>
+        <w:t>- Data preprocessing, feature scaling, evaluation (confusion matrix, precision, recall, F1).</w:t>
+      </w:r>
+    </w:p>
+    <w:p>
+      <w:pPr>
+        <w:spacing w:after="6"/>
+        <w:ind w:left="288"/>
+      </w:pPr>
+      <w:r>
+        <w:rPr>
+          <w:rFonts w:ascii="Calibri" w:hAnsi="Calibri"/>
+          <w:color w:val="333333"/>
+          <w:sz w:val="18"/>
+        </w:rPr>
+        <w:t>- Live: soil-fertilizer.netlify.app | GitHub: github.com/Naveenkm07/Soil-Fertilisation-Analyzer-07</w:t>
+      </w:r>
+    </w:p>
+    <w:p>
+      <w:pPr>
+        <w:spacing w:after="6" w:before="40"/>
+      </w:pPr>
+      <w:r>
+        <w:rPr>
+          <w:rFonts w:ascii="Calibri" w:hAnsi="Calibri"/>
+          <w:b/>
+          <w:sz w:val="19"/>
+        </w:rPr>
+        <w:t>SecureVault - Data Management System</w:t>
+      </w:r>
+      <w:r>
+        <w:rPr>
+          <w:rFonts w:ascii="Calibri" w:hAnsi="Calibri"/>
+          <w:i/>
+          <w:color w:val="555555"/>
+          <w:sz w:val="17"/>
+        </w:rPr>
+        <w:t xml:space="preserve">  |  Python, SQL, Flask, AES-256</w:t>
+      </w:r>
+    </w:p>
+    <w:p>
+      <w:pPr>
+        <w:spacing w:after="6"/>
+        <w:ind w:left="288"/>
+      </w:pPr>
+      <w:r>
+        <w:rPr>
+          <w:rFonts w:ascii="Calibri" w:hAnsi="Calibri"/>
+          <w:color w:val="333333"/>
+          <w:sz w:val="18"/>
+        </w:rPr>
+        <w:t>- Python + SQL backend with RBAC and AES-256 encryption. Optimized queries for 40% faster retrieval.</w:t>
+      </w:r>
+    </w:p>
+    <w:p>
+      <w:pPr>
+        <w:spacing w:after="6"/>
+        <w:ind w:left="288"/>
+      </w:pPr>
+      <w:r>
+        <w:rPr>
+          <w:rFonts w:ascii="Calibri" w:hAnsi="Calibri"/>
+          <w:color w:val="333333"/>
+          <w:sz w:val="18"/>
+        </w:rPr>
+        <w:t>- Live: cse-tau.vercel.app | GitHub: github.com/Naveenkm07/PersonalDataManager-ADV</w:t>
+      </w:r>
+    </w:p>
+    <w:p>
+      <w:pPr>
+        <w:spacing w:after="6" w:before="40"/>
+      </w:pPr>
+      <w:r>
+        <w:rPr>
+          <w:rFonts w:ascii="Calibri" w:hAnsi="Calibri"/>
+          <w:b/>
+          <w:sz w:val="19"/>
+        </w:rPr>
+        <w:t>Spam Email Classifier</w:t>
+      </w:r>
+      <w:r>
+        <w:rPr>
+          <w:rFonts w:ascii="Calibri" w:hAnsi="Calibri"/>
+          <w:i/>
+          <w:color w:val="555555"/>
+          <w:sz w:val="17"/>
+        </w:rPr>
+        <w:t xml:space="preserve">  |  Python, scikit-learn, NLP, Pandas</w:t>
+      </w:r>
+    </w:p>
+    <w:p>
+      <w:pPr>
+        <w:spacing w:after="6"/>
+        <w:ind w:left="288"/>
+      </w:pPr>
+      <w:r>
+        <w:rPr>
+          <w:rFonts w:ascii="Calibri" w:hAnsi="Calibri"/>
+          <w:color w:val="333333"/>
+          <w:sz w:val="18"/>
+        </w:rPr>
+        <w:t>- NLP-based ML classifier for spam detection using tokenization, vectorization, and feature engineering.</w:t>
+      </w:r>
+    </w:p>
+    <w:p>
+      <w:pPr>
+        <w:spacing w:after="6"/>
+        <w:ind w:left="288"/>
+      </w:pPr>
+      <w:r>
+        <w:rPr>
+          <w:rFonts w:ascii="Calibri" w:hAnsi="Calibri"/>
+          <w:color w:val="333333"/>
+          <w:sz w:val="18"/>
+        </w:rPr>
+        <w:t>- Live: spam-email-classification.vercel.app | GitHub: github.com/Naveenkm07/spam-email-classification</w:t>
+      </w:r>
+    </w:p>
+    <w:p>
+      <w:pPr>
+        <w:spacing w:before="120" w:after="30"/>
+        <w:pBdr>
+          <w:bottom w:val="single" w:sz="4" w:space="1" w:color="333333"/>
+        </w:pBdr>
+      </w:pPr>
+      <w:r>
+        <w:rPr>
+          <w:rFonts w:ascii="Calibri" w:hAnsi="Calibri"/>
+          <w:b/>
+          <w:color w:val="1A1A1A"/>
+          <w:sz w:val="21"/>
+        </w:rPr>
+        <w:t>EDUCATION</w:t>
+      </w:r>
+    </w:p>
+    <w:p>
+      <w:pPr>
+        <w:spacing w:after="6"/>
+      </w:pPr>
+      <w:r>
+        <w:rPr>
+          <w:rFonts w:ascii="Calibri" w:hAnsi="Calibri"/>
+          <w:b/>
+          <w:sz w:val="18"/>
+        </w:rPr>
+        <w:t>B.E. in Computer Science and Engineering</w:t>
+      </w:r>
+      <w:r>
+        <w:rPr>
+          <w:rFonts w:ascii="Calibri" w:hAnsi="Calibri"/>
+          <w:color w:val="555555"/>
+          <w:sz w:val="17"/>
+        </w:rPr>
+        <w:t xml:space="preserve">  -  New Horizon College of Engineering, Bengaluru | 2024-2027 | CGPA: 8.56</w:t>
+      </w:r>
+    </w:p>
+    <w:p>
+      <w:pPr>
+        <w:spacing w:after="6"/>
+      </w:pPr>
+      <w:r>
+        <w:rPr>
+          <w:rFonts w:ascii="Calibri" w:hAnsi="Calibri"/>
+          <w:b/>
+          <w:sz w:val="18"/>
+        </w:rPr>
+        <w:t>Diploma in Computer Science Engineering</w:t>
+      </w:r>
+      <w:r>
+        <w:rPr>
+          <w:rFonts w:ascii="Calibri" w:hAnsi="Calibri"/>
+          <w:color w:val="555555"/>
+          <w:sz w:val="17"/>
+        </w:rPr>
+        <w:t xml:space="preserve">  -  SJM Polytechnic, Chitradurga | 2021-2024 | 82.12%</w:t>
+      </w:r>
+    </w:p>
+    <w:p>
+      <w:pPr>
+        <w:spacing w:after="6"/>
+      </w:pPr>
+      <w:r>
+        <w:rPr>
+          <w:rFonts w:ascii="Calibri" w:hAnsi="Calibri"/>
+          <w:b/>
+          <w:sz w:val="18"/>
+        </w:rPr>
+        <w:t>SSLC</w:t>
+      </w:r>
+      <w:r>
+        <w:rPr>
+          <w:rFonts w:ascii="Calibri" w:hAnsi="Calibri"/>
+          <w:color w:val="555555"/>
+          <w:sz w:val="17"/>
+        </w:rPr>
+        <w:t xml:space="preserve">  -  SJM Residential School, Chitradurga | 2020-2021 | 93.12%</w:t>
+      </w:r>
+    </w:p>
+    <w:p>
+      <w:pPr>
+        <w:spacing w:before="120" w:after="30"/>
+        <w:pBdr>
+          <w:bottom w:val="single" w:sz="4" w:space="1" w:color="333333"/>
+        </w:pBdr>
+      </w:pPr>
+      <w:r>
+        <w:rPr>
+          <w:rFonts w:ascii="Calibri" w:hAnsi="Calibri"/>
+          <w:b/>
+          <w:color w:val="1A1A1A"/>
+          <w:sz w:val="21"/>
+        </w:rPr>
+        <w:t>ACHIEVEMENTS &amp; LEADERSHIP</w:t>
+      </w:r>
+    </w:p>
+    <w:p>
+      <w:pPr>
+        <w:spacing w:after="6"/>
+        <w:ind w:left="288"/>
+      </w:pPr>
+      <w:r>
+        <w:rPr>
+          <w:rFonts w:ascii="Calibri" w:hAnsi="Calibri"/>
+          <w:color w:val="333333"/>
+          <w:sz w:val="18"/>
+        </w:rPr>
+        <w:t>- 2nd Place - Srujana 2025 Hackathon (Chanakya University), awarded by Former ISRO Chairman.</w:t>
+      </w:r>
+    </w:p>
+    <w:p>
+      <w:pPr>
+        <w:spacing w:after="6"/>
+        <w:ind w:left="288"/>
+      </w:pPr>
+      <w:r>
+        <w:rPr>
+          <w:rFonts w:ascii="Calibri" w:hAnsi="Calibri"/>
+          <w:color w:val="333333"/>
+          <w:sz w:val="18"/>
+        </w:rPr>
+        <w:t>- 2nd Prize - Mini Project Competition at NHCE, awarded by Dr. Manjunath S, Principal.</w:t>
+      </w:r>
+    </w:p>
+    <w:p>
+      <w:pPr>
+        <w:spacing w:after="6"/>
+        <w:ind w:left="288"/>
+      </w:pPr>
+      <w:r>
+        <w:rPr>
+          <w:rFonts w:ascii="Calibri" w:hAnsi="Calibri"/>
+          <w:color w:val="333333"/>
+          <w:sz w:val="18"/>
+        </w:rPr>
+        <w:t>- TEDx NHCE Board Member (2025-2026) - Event coordination, stakeholder communication.</w:t>
+      </w:r>
+    </w:p>
+    <w:p>
+      <w:pPr>
+        <w:spacing w:after="6"/>
+        <w:ind w:left="288"/>
+      </w:pPr>
+      <w:r>
+        <w:rPr>
+          <w:rFonts w:ascii="Calibri" w:hAnsi="Calibri"/>
+          <w:color w:val="333333"/>
+          <w:sz w:val="18"/>
+        </w:rPr>
+        <w:t>- 10+ national-level hackathons - Project planning, documentation, and team leadership.</w:t>
+      </w:r>
+    </w:p>
+    <w:p>
+      <w:pPr>
+        <w:spacing w:after="6"/>
+        <w:ind w:left="288"/>
+      </w:pPr>
+      <w:r>
+        <w:rPr>
+          <w:rFonts w:ascii="Calibri" w:hAnsi="Calibri"/>
+          <w:color w:val="333333"/>
+          <w:sz w:val="18"/>
+        </w:rPr>
+        <w:t>- Open-source contributor with 70+ public repositories on GitHub.</w:t>
+      </w:r>
+    </w:p>
+    <w:p>
+      <w:pPr>
+        <w:spacing w:before="120" w:after="30"/>
+        <w:pBdr>
+          <w:bottom w:val="single" w:sz="4" w:space="1" w:color="333333"/>
+        </w:pBdr>
+      </w:pPr>
+      <w:r>
+        <w:rPr>
+          <w:rFonts w:ascii="Calibri" w:hAnsi="Calibri"/>
+          <w:b/>
+          <w:color w:val="1A1A1A"/>
+          <w:sz w:val="21"/>
         </w:rPr>
         <w:t>CERTIFICATIONS</w:t>
       </w:r>
     </w:p>
     <w:p>
       <w:pPr>
-        <w:spacing w:after="10"/>
-        <w:ind w:left="360"/>
+        <w:spacing w:after="6"/>
+        <w:ind w:left="288"/>
       </w:pPr>
       <w:r>
         <w:rPr>
           <w:rFonts w:ascii="Calibri" w:hAnsi="Calibri"/>
           <w:color w:val="333333"/>
-          <w:sz w:val="19"/>
+          <w:sz w:val="18"/>
         </w:rPr>
-        <w:t>- Building Intelligent Agents with Generative AI - New Horizon College of Engineering (Oct 2025)</w:t>
+        <w:t>- Building Intelligent Agents with Generative AI - NHCE (2025)</w:t>
       </w:r>
     </w:p>
     <w:p>
       <w:pPr>
-        <w:spacing w:after="10"/>
-        <w:ind w:left="360"/>
+        <w:spacing w:after="6"/>
+        <w:ind w:left="288"/>
       </w:pPr>
       <w:r>
         <w:rPr>
           <w:rFonts w:ascii="Calibri" w:hAnsi="Calibri"/>
           <w:color w:val="333333"/>
-          <w:sz w:val="19"/>
+          <w:sz w:val="18"/>
         </w:rPr>
-        <w:t>- Hands-on with Azure Cloud &amp; AI Fundamentals - New Horizon College of Engineering (Oct 2025)</w:t>
+        <w:t>- Azure Cloud &amp; AI Fundamentals - NHCE (2025)</w:t>
       </w:r>
     </w:p>
     <w:p>
       <w:pPr>
-        <w:spacing w:after="10"/>
-        <w:ind w:left="360"/>
+        <w:spacing w:after="6"/>
+        <w:ind w:left="288"/>
       </w:pPr>
       <w:r>
         <w:rPr>
           <w:rFonts w:ascii="Calibri" w:hAnsi="Calibri"/>
           <w:color w:val="333333"/>
-          <w:sz w:val="19"/>
+          <w:sz w:val="18"/>
         </w:rPr>
-        <w:t>- AI For All - Intel (Jul 2025)</w:t>
+        <w:t>- AI For All - Intel (2025)</w:t>
       </w:r>
     </w:p>
     <w:p>
       <w:pPr>
-        <w:spacing w:after="10"/>
-        <w:ind w:left="360"/>
+        <w:spacing w:after="6"/>
+        <w:ind w:left="288"/>
       </w:pPr>
       <w:r>
         <w:rPr>
           <w:rFonts w:ascii="Calibri" w:hAnsi="Calibri"/>
           <w:color w:val="333333"/>
-          <w:sz w:val="19"/>
+          <w:sz w:val="18"/>
         </w:rPr>
-        <w:t>- Gen AI Powered Data Analytics Job Simulation - Forage (Jul 2025)</w:t>
+        <w:t>- Gen AI Powered Data Analytics - Forage (2025)</w:t>
       </w:r>
     </w:p>
     <w:p>
       <w:pPr>
-        <w:spacing w:after="10"/>
-        <w:ind w:left="360"/>
+        <w:spacing w:after="6"/>
+        <w:ind w:left="288"/>
       </w:pPr>
       <w:r>
         <w:rPr>
           <w:rFonts w:ascii="Calibri" w:hAnsi="Calibri"/>
           <w:color w:val="333333"/>
-          <w:sz w:val="19"/>
+          <w:sz w:val="18"/>
         </w:rPr>
-        <w:t>- AI/ML Industry Certification - Crystallize Technologies</w:t>
-      </w:r>
-    </w:p>
-    <w:p>
-      <w:pPr>
-        <w:spacing w:after="10"/>
-        <w:ind w:left="360"/>
-      </w:pPr>
-      <w:r>
-        <w:rPr>
-          <w:rFonts w:ascii="Calibri" w:hAnsi="Calibri"/>
-          <w:color w:val="333333"/>
-          <w:sz w:val="19"/>
-        </w:rPr>
-        <w:t>- AI/ML Internship Completion Certificate - Ember Quest</w:t>
-      </w:r>
-    </w:p>
-    <w:p>
-      <w:pPr>
-        <w:spacing w:after="10"/>
-        <w:ind w:left="360"/>
-      </w:pPr>
-      <w:r>
-        <w:rPr>
-          <w:rFonts w:ascii="Calibri" w:hAnsi="Calibri"/>
-          <w:color w:val="333333"/>
-          <w:sz w:val="19"/>
-        </w:rPr>
-        <w:t>- J.P. Morgan Software Engineering Job Simulation - Forage (Aug 2025)</w:t>
-      </w:r>
-    </w:p>
-    <w:p>
-      <w:pPr>
-        <w:spacing w:after="10"/>
-        <w:ind w:left="360"/>
-      </w:pPr>
-      <w:r>
-        <w:rPr>
-          <w:rFonts w:ascii="Calibri" w:hAnsi="Calibri"/>
-          <w:color w:val="333333"/>
-          <w:sz w:val="19"/>
-        </w:rPr>
-        <w:t>- AWS Solutions Architecture Job Simulation - Forage (Aug 2025)</w:t>
+        <w:t>- AI/ML Certification - Crystallize Technologies | AI/ML Certificate - Ember Quest</w:t>
       </w:r>
     </w:p>
     <w:sectPr>
       <w:pgSz w:w="12240" w:h="15840"/>
-      <w:pgMar w:top="576" w:right="792" w:bottom="576" w:left="792" w:header="720" w:footer="720" w:gutter="0"/>
+      <w:pgMar w:top="504" w:right="720" w:bottom="432" w:left="720" w:header="720" w:footer="720" w:gutter="0"/>
       <w:cols w:space="720"/>
       <w:docGrid w:linePitch="360"/>
     </w:sectPr>
@@ -1363,12 +1231,12 @@
     <w:qFormat/>
     <w:rsid w:val="00FC693F"/>
     <w:pPr>
-      <w:spacing w:after="20" w:before="0" w:line="264" w:lineRule="auto"/>
+      <w:spacing w:after="0" w:before="0" w:line="259" w:lineRule="auto"/>
     </w:pPr>
     <w:rPr>
       <w:rFonts w:ascii="Calibri" w:hAnsi="Calibri"/>
       <w:color w:val="333333"/>
-      <w:sz w:val="20"/>
+      <w:sz w:val="19"/>
     </w:rPr>
   </w:style>
   <w:style w:type="paragraph" w:styleId="Header">

</xml_diff>

<commit_message>
Restored full content on 1 page - all certs and full summary
</commit_message>
<xml_diff>
--- a/Naveen_Kumar_KM_Resume_1021_FINAL.docx
+++ b/Naveen_Kumar_KM_Resume_1021_FINAL.docx
@@ -4,7 +4,7 @@
   <w:body>
     <w:p>
       <w:pPr>
-        <w:spacing w:after="20"/>
+        <w:spacing w:after="10"/>
         <w:jc w:val="center"/>
       </w:pPr>
       <w:r>
@@ -19,6 +19,20 @@
     </w:p>
     <w:p>
       <w:pPr>
+        <w:spacing w:after="6"/>
+        <w:jc w:val="center"/>
+      </w:pPr>
+      <w:r>
+        <w:rPr>
+          <w:rFonts w:ascii="Calibri" w:hAnsi="Calibri"/>
+          <w:color w:val="444444"/>
+          <w:sz w:val="17"/>
+        </w:rPr>
+        <w:t>+91 9591502209 | kmnaveenkm85@gmail.com</w:t>
+      </w:r>
+    </w:p>
+    <w:p>
+      <w:pPr>
         <w:spacing w:after="10"/>
         <w:jc w:val="center"/>
       </w:pPr>
@@ -26,32 +40,17 @@
         <w:rPr>
           <w:rFonts w:ascii="Calibri" w:hAnsi="Calibri"/>
           <w:color w:val="444444"/>
-          <w:sz w:val="18"/>
-        </w:rPr>
-        <w:t>+91 9591502209 | kmnaveenkm85@gmail.com</w:t>
-      </w:r>
-    </w:p>
-    <w:p>
-      <w:pPr>
-        <w:spacing w:after="20"/>
-        <w:jc w:val="center"/>
-      </w:pPr>
-      <w:r>
-        <w:rPr>
-          <w:rFonts w:ascii="Calibri" w:hAnsi="Calibri"/>
-          <w:color w:val="444444"/>
-          <w:sz w:val="18"/>
+          <w:sz w:val="17"/>
         </w:rPr>
         <w:t xml:space="preserve">LinkedIn: </w:t>
       </w:r>
       <w:hyperlink r:id="rId9">
         <w:r>
           <w:rPr>
-            <w:rStyle w:val="Hyperlink"/>
-            <w:sz w:val="19"/>
+            <w:sz w:val="17"/>
             <w:rFonts w:ascii="Calibri" w:hAnsi="Calibri"/>
-            <w:color w:val="444444"/>
-            <w:u w:val="none"/>
+            <w:color w:val="0563C1"/>
+            <w:u w:val="single"/>
           </w:rPr>
           <w:t>linkedin.com/in/naveenkm07</w:t>
         </w:r>
@@ -60,18 +59,17 @@
         <w:rPr>
           <w:rFonts w:ascii="Calibri" w:hAnsi="Calibri"/>
           <w:color w:val="444444"/>
-          <w:sz w:val="18"/>
+          <w:sz w:val="17"/>
         </w:rPr>
         <w:t xml:space="preserve"> | GitHub: </w:t>
       </w:r>
       <w:hyperlink r:id="rId10">
         <w:r>
           <w:rPr>
-            <w:rStyle w:val="Hyperlink"/>
-            <w:sz w:val="19"/>
+            <w:sz w:val="17"/>
             <w:rFonts w:ascii="Calibri" w:hAnsi="Calibri"/>
-            <w:color w:val="444444"/>
-            <w:u w:val="none"/>
+            <w:color w:val="0563C1"/>
+            <w:u w:val="single"/>
           </w:rPr>
           <w:t>github.com/Naveenkm07</w:t>
         </w:r>
@@ -80,18 +78,17 @@
         <w:rPr>
           <w:rFonts w:ascii="Calibri" w:hAnsi="Calibri"/>
           <w:color w:val="444444"/>
-          <w:sz w:val="18"/>
+          <w:sz w:val="17"/>
         </w:rPr>
         <w:t xml:space="preserve"> | Portfolio: </w:t>
       </w:r>
       <w:hyperlink r:id="rId11">
         <w:r>
           <w:rPr>
-            <w:rStyle w:val="Hyperlink"/>
-            <w:sz w:val="19"/>
+            <w:sz w:val="17"/>
             <w:rFonts w:ascii="Calibri" w:hAnsi="Calibri"/>
-            <w:color w:val="444444"/>
-            <w:u w:val="none"/>
+            <w:color w:val="0563C1"/>
+            <w:u w:val="single"/>
           </w:rPr>
           <w:t>naveenkm07.netlify.app</w:t>
         </w:r>
@@ -99,7 +96,7 @@
     </w:p>
     <w:p>
       <w:pPr>
-        <w:spacing w:before="120" w:after="30"/>
+        <w:spacing w:before="100" w:after="20"/>
         <w:pBdr>
           <w:bottom w:val="single" w:sz="4" w:space="1" w:color="333333"/>
         </w:pBdr>
@@ -109,27 +106,27 @@
           <w:rFonts w:ascii="Calibri" w:hAnsi="Calibri"/>
           <w:b/>
           <w:color w:val="1A1A1A"/>
-          <w:sz w:val="21"/>
+          <w:sz w:val="20"/>
         </w:rPr>
         <w:t>PROFESSIONAL SUMMARY</w:t>
       </w:r>
     </w:p>
     <w:p>
       <w:pPr>
-        <w:spacing w:after="20"/>
+        <w:spacing w:after="10"/>
       </w:pPr>
       <w:r>
         <w:rPr>
           <w:rFonts w:ascii="Calibri" w:hAnsi="Calibri"/>
           <w:color w:val="333333"/>
-          <w:sz w:val="18"/>
+          <w:sz w:val="17"/>
         </w:rPr>
-        <w:t>CSE student with 7 months of AI/ML internship experience in Python, SQL, and scikit-learn. Built and deployed ML models for classification, data analysis, and prediction tasks. Familiar with Agile workflows, Git-based collaboration, and project documentation. Currently exploring Generative AI and LLM concepts. Active open-source contributor with 70+ GitHub repositories. Won 2nd place at Srujana 2025 Hackathon.</w:t>
+        <w:t>Computer Science and Engineering student with hands-on experience in Python, SQL, machine learning, and data-driven problem solving. Completed 7 months of AI/ML internship training covering model development, data analysis, and deployment workflows. Experienced in project coordination, team collaboration, and documentation through 10+ hackathons and leadership roles. Exploring Generative AI concepts including LLMs and embeddings. Maintains 70+ public GitHub repositories with CI/CD workflows. Seeking an internship to apply data analysis, ML, and project coordination skills in a professional environment.</w:t>
       </w:r>
     </w:p>
     <w:p>
       <w:pPr>
-        <w:spacing w:before="120" w:after="30"/>
+        <w:spacing w:before="100" w:after="20"/>
         <w:pBdr>
           <w:bottom w:val="single" w:sz="4" w:space="1" w:color="333333"/>
         </w:pBdr>
@@ -139,161 +136,182 @@
           <w:rFonts w:ascii="Calibri" w:hAnsi="Calibri"/>
           <w:b/>
           <w:color w:val="1A1A1A"/>
-          <w:sz w:val="21"/>
+          <w:sz w:val="20"/>
         </w:rPr>
         <w:t>TECHNICAL SKILLS</w:t>
       </w:r>
     </w:p>
     <w:p>
       <w:pPr>
-        <w:spacing w:after="6"/>
+        <w:spacing w:after="4"/>
       </w:pPr>
       <w:r>
         <w:rPr>
           <w:rFonts w:ascii="Calibri" w:hAnsi="Calibri"/>
           <w:b/>
-          <w:sz w:val="18"/>
+          <w:sz w:val="17"/>
         </w:rPr>
-        <w:t xml:space="preserve">Programming: </w:t>
+        <w:t xml:space="preserve">Programming &amp; Data: </w:t>
       </w:r>
       <w:r>
         <w:rPr>
           <w:rFonts w:ascii="Calibri" w:hAnsi="Calibri"/>
           <w:color w:val="333333"/>
-          <w:sz w:val="18"/>
+          <w:sz w:val="17"/>
         </w:rPr>
         <w:t>Python, SQL, C, C++, Pandas, NumPy, Matplotlib</w:t>
       </w:r>
     </w:p>
     <w:p>
       <w:pPr>
-        <w:spacing w:after="6"/>
+        <w:spacing w:after="4"/>
       </w:pPr>
       <w:r>
         <w:rPr>
           <w:rFonts w:ascii="Calibri" w:hAnsi="Calibri"/>
           <w:b/>
-          <w:sz w:val="18"/>
+          <w:sz w:val="17"/>
         </w:rPr>
-        <w:t xml:space="preserve">ML &amp; AI: </w:t>
+        <w:t xml:space="preserve">Machine Learning: </w:t>
       </w:r>
       <w:r>
         <w:rPr>
           <w:rFonts w:ascii="Calibri" w:hAnsi="Calibri"/>
           <w:color w:val="333333"/>
-          <w:sz w:val="18"/>
+          <w:sz w:val="17"/>
         </w:rPr>
-        <w:t>scikit-learn, Classification, Regression, Clustering, NLP, Data Preprocessing, Model Evaluation</w:t>
+        <w:t>scikit-learn, Classification, Regression, Clustering, NLP (Text Classification), Model Evaluation (Confusion Matrix, Precision, Recall, F1-Score), Data Preprocessing, Feature Engineering</w:t>
       </w:r>
     </w:p>
     <w:p>
       <w:pPr>
-        <w:spacing w:after="6"/>
+        <w:spacing w:after="4"/>
       </w:pPr>
       <w:r>
         <w:rPr>
           <w:rFonts w:ascii="Calibri" w:hAnsi="Calibri"/>
           <w:b/>
-          <w:sz w:val="18"/>
+          <w:sz w:val="17"/>
         </w:rPr>
-        <w:t xml:space="preserve">Exploring: </w:t>
+        <w:t xml:space="preserve">AI Interests: </w:t>
       </w:r>
       <w:r>
         <w:rPr>
           <w:rFonts w:ascii="Calibri" w:hAnsi="Calibri"/>
           <w:color w:val="333333"/>
-          <w:sz w:val="18"/>
+          <w:sz w:val="17"/>
         </w:rPr>
-        <w:t>Generative AI (LLMs, Embeddings, Vector Stores), Agentic AI Concepts</w:t>
+        <w:t>Exploring Generative AI (LLMs, Embeddings, Vector Stores), Agentic AI Concepts</w:t>
       </w:r>
     </w:p>
     <w:p>
       <w:pPr>
-        <w:spacing w:after="6"/>
+        <w:spacing w:after="4"/>
       </w:pPr>
       <w:r>
         <w:rPr>
           <w:rFonts w:ascii="Calibri" w:hAnsi="Calibri"/>
           <w:b/>
-          <w:sz w:val="18"/>
+          <w:sz w:val="17"/>
         </w:rPr>
-        <w:t xml:space="preserve">Databases: </w:t>
+        <w:t xml:space="preserve">Data &amp; Databases: </w:t>
       </w:r>
       <w:r>
         <w:rPr>
           <w:rFonts w:ascii="Calibri" w:hAnsi="Calibri"/>
           <w:color w:val="333333"/>
-          <w:sz w:val="18"/>
+          <w:sz w:val="17"/>
         </w:rPr>
-        <w:t>MySQL, MongoDB, SQLite</w:t>
+        <w:t>MySQL, MongoDB, SQLite, Data Analysis, Data Visualization</w:t>
       </w:r>
     </w:p>
     <w:p>
       <w:pPr>
-        <w:spacing w:after="6"/>
+        <w:spacing w:after="4"/>
       </w:pPr>
       <w:r>
         <w:rPr>
           <w:rFonts w:ascii="Calibri" w:hAnsi="Calibri"/>
           <w:b/>
-          <w:sz w:val="18"/>
+          <w:sz w:val="17"/>
         </w:rPr>
-        <w:t xml:space="preserve">Tools &amp; CI/CD: </w:t>
+        <w:t xml:space="preserve">Version Control &amp; CI/CD: </w:t>
       </w:r>
       <w:r>
         <w:rPr>
           <w:rFonts w:ascii="Calibri" w:hAnsi="Calibri"/>
           <w:color w:val="333333"/>
-          <w:sz w:val="18"/>
+          <w:sz w:val="17"/>
         </w:rPr>
-        <w:t>Git, GitHub, Docker, Jenkins, CI/CD, Postman, Selenium, Flask</w:t>
+        <w:t>Git, GitHub, CI/CD Pipelines, Docker, Jenkins</w:t>
       </w:r>
     </w:p>
     <w:p>
       <w:pPr>
-        <w:spacing w:after="6"/>
+        <w:spacing w:after="4"/>
       </w:pPr>
       <w:r>
         <w:rPr>
           <w:rFonts w:ascii="Calibri" w:hAnsi="Calibri"/>
           <w:b/>
-          <w:sz w:val="18"/>
+          <w:sz w:val="17"/>
         </w:rPr>
-        <w:t xml:space="preserve">Cloud: </w:t>
+        <w:t xml:space="preserve">Cloud Platforms: </w:t>
       </w:r>
       <w:r>
         <w:rPr>
           <w:rFonts w:ascii="Calibri" w:hAnsi="Calibri"/>
           <w:color w:val="333333"/>
-          <w:sz w:val="18"/>
+          <w:sz w:val="17"/>
         </w:rPr>
-        <w:t>AWS, Azure, GCP (Basic)</w:t>
+        <w:t>AWS (Basic), Azure (Basic), GCP (Basic)</w:t>
       </w:r>
     </w:p>
     <w:p>
       <w:pPr>
-        <w:spacing w:after="6"/>
+        <w:spacing w:after="4"/>
       </w:pPr>
       <w:r>
         <w:rPr>
           <w:rFonts w:ascii="Calibri" w:hAnsi="Calibri"/>
           <w:b/>
-          <w:sz w:val="18"/>
+          <w:sz w:val="17"/>
         </w:rPr>
-        <w:t xml:space="preserve">Soft Skills: </w:t>
+        <w:t xml:space="preserve">Project &amp; Agile: </w:t>
       </w:r>
       <w:r>
         <w:rPr>
           <w:rFonts w:ascii="Calibri" w:hAnsi="Calibri"/>
           <w:color w:val="333333"/>
-          <w:sz w:val="18"/>
+          <w:sz w:val="17"/>
         </w:rPr>
-        <w:t>Agile, SDLC, Project Documentation, Team Coordination, Stakeholder Communication</w:t>
+        <w:t>Agile Methodology, SDLC, Project Documentation, Team Coordination, Stakeholder Communication</w:t>
       </w:r>
     </w:p>
     <w:p>
       <w:pPr>
-        <w:spacing w:before="120" w:after="30"/>
+        <w:spacing w:after="4"/>
+      </w:pPr>
+      <w:r>
+        <w:rPr>
+          <w:rFonts w:ascii="Calibri" w:hAnsi="Calibri"/>
+          <w:b/>
+          <w:sz w:val="17"/>
+        </w:rPr>
+        <w:t xml:space="preserve">Other Tools: </w:t>
+      </w:r>
+      <w:r>
+        <w:rPr>
+          <w:rFonts w:ascii="Calibri" w:hAnsi="Calibri"/>
+          <w:color w:val="333333"/>
+          <w:sz w:val="17"/>
+        </w:rPr>
+        <w:t>Postman, Selenium, pytest, REST API Testing, Flask, HTML, CSS, JavaScript</w:t>
+      </w:r>
+    </w:p>
+    <w:p>
+      <w:pPr>
+        <w:spacing w:before="100" w:after="20"/>
         <w:pBdr>
           <w:bottom w:val="single" w:sz="4" w:space="1" w:color="333333"/>
         </w:pBdr>
@@ -303,20 +321,20 @@
           <w:rFonts w:ascii="Calibri" w:hAnsi="Calibri"/>
           <w:b/>
           <w:color w:val="1A1A1A"/>
-          <w:sz w:val="21"/>
+          <w:sz w:val="20"/>
         </w:rPr>
         <w:t>PROFESSIONAL EXPERIENCE</w:t>
       </w:r>
     </w:p>
     <w:p>
       <w:pPr>
-        <w:spacing w:after="6" w:before="40"/>
+        <w:spacing w:after="4" w:before="30"/>
       </w:pPr>
       <w:r>
         <w:rPr>
           <w:rFonts w:ascii="Calibri" w:hAnsi="Calibri"/>
           <w:b/>
-          <w:sz w:val="19"/>
+          <w:sz w:val="18"/>
         </w:rPr>
         <w:t>AI/ML Intern - Ember Quest</w:t>
       </w:r>
@@ -325,62 +343,76 @@
           <w:rFonts w:ascii="Calibri" w:hAnsi="Calibri"/>
           <w:i/>
           <w:color w:val="555555"/>
-          <w:sz w:val="18"/>
+          <w:sz w:val="17"/>
         </w:rPr>
         <w:t xml:space="preserve">  |  4 Months</w:t>
       </w:r>
     </w:p>
     <w:p>
       <w:pPr>
-        <w:spacing w:after="6"/>
+        <w:spacing w:after="4"/>
         <w:ind w:left="288"/>
       </w:pPr>
       <w:r>
         <w:rPr>
           <w:rFonts w:ascii="Calibri" w:hAnsi="Calibri"/>
           <w:color w:val="333333"/>
-          <w:sz w:val="18"/>
+          <w:sz w:val="17"/>
         </w:rPr>
-        <w:t>- Trained and tested ML models (classification, regression) on real datasets using Python and scikit-learn.</w:t>
+        <w:t>- Built and evaluated ML models for classification and regression tasks using Python and scikit-learn on real-world datasets.</w:t>
       </w:r>
     </w:p>
     <w:p>
       <w:pPr>
-        <w:spacing w:after="6"/>
+        <w:spacing w:after="4"/>
         <w:ind w:left="288"/>
       </w:pPr>
       <w:r>
         <w:rPr>
           <w:rFonts w:ascii="Calibri" w:hAnsi="Calibri"/>
           <w:color w:val="333333"/>
-          <w:sz w:val="18"/>
+          <w:sz w:val="17"/>
         </w:rPr>
-        <w:t>- Handled data preprocessing, feature engineering, and model evaluation in Agile sprints.</w:t>
+        <w:t>- Performed data preprocessing, feature engineering, and exploratory data analysis to prepare datasets for model training.</w:t>
       </w:r>
     </w:p>
     <w:p>
       <w:pPr>
-        <w:spacing w:after="6"/>
+        <w:spacing w:after="4"/>
         <w:ind w:left="288"/>
       </w:pPr>
       <w:r>
         <w:rPr>
           <w:rFonts w:ascii="Calibri" w:hAnsi="Calibri"/>
           <w:color w:val="333333"/>
-          <w:sz w:val="18"/>
+          <w:sz w:val="17"/>
         </w:rPr>
-        <w:t>- Documented results and presented findings to team leads for iterative improvements.</w:t>
+        <w:t>- Supported model experimentation and structured workflow tracking in an Agile development environment.</w:t>
       </w:r>
     </w:p>
     <w:p>
       <w:pPr>
-        <w:spacing w:after="6" w:before="40"/>
+        <w:spacing w:after="4"/>
+        <w:ind w:left="288"/>
+      </w:pPr>
+      <w:r>
+        <w:rPr>
+          <w:rFonts w:ascii="Calibri" w:hAnsi="Calibri"/>
+          <w:color w:val="333333"/>
+          <w:sz w:val="17"/>
+        </w:rPr>
+        <w:t>- Documented findings, presented results to team leads, and collaborated with cross-functional team members.</w:t>
+      </w:r>
+    </w:p>
+    <w:p>
+      <w:pPr>
+        <w:spacing w:after="4" w:before="30"/>
       </w:pPr>
       <w:r>
         <w:rPr>
           <w:rFonts w:ascii="Calibri" w:hAnsi="Calibri"/>
           <w:b/>
-          <w:sz w:val="19"/>
+          <w:sz w:val="18"/>
         </w:rPr>
         <w:t>AI/ML Industry Trainee - Crystallize Technologies</w:t>
       </w:r>
@@ -389,42 +421,56 @@
           <w:rFonts w:ascii="Calibri" w:hAnsi="Calibri"/>
           <w:i/>
           <w:color w:val="555555"/>
-          <w:sz w:val="18"/>
+          <w:sz w:val="17"/>
         </w:rPr>
         <w:t xml:space="preserve">  |  3 Months</w:t>
       </w:r>
     </w:p>
     <w:p>
       <w:pPr>
-        <w:spacing w:after="6"/>
+        <w:spacing w:after="4"/>
         <w:ind w:left="288"/>
       </w:pPr>
       <w:r>
         <w:rPr>
           <w:rFonts w:ascii="Calibri" w:hAnsi="Calibri"/>
           <w:color w:val="333333"/>
-          <w:sz w:val="18"/>
+          <w:sz w:val="17"/>
         </w:rPr>
-        <w:t>- Completed hands-on training in ML, deep learning, and model optimization.</w:t>
+        <w:t>- Completed advanced training in machine learning, deep learning concepts, and model optimization techniques.</w:t>
       </w:r>
     </w:p>
     <w:p>
       <w:pPr>
-        <w:spacing w:after="6"/>
+        <w:spacing w:after="4"/>
         <w:ind w:left="288"/>
       </w:pPr>
       <w:r>
         <w:rPr>
           <w:rFonts w:ascii="Calibri" w:hAnsi="Calibri"/>
           <w:color w:val="333333"/>
-          <w:sz w:val="18"/>
+          <w:sz w:val="17"/>
         </w:rPr>
-        <w:t>- Delivered project presentations on ML outcomes to mentors and peers.</w:t>
+        <w:t>- Worked on industry-relevant ML projects involving data cleaning, transformation, and evaluation workflows.</w:t>
       </w:r>
     </w:p>
     <w:p>
       <w:pPr>
-        <w:spacing w:before="120" w:after="30"/>
+        <w:spacing w:after="4"/>
+        <w:ind w:left="288"/>
+      </w:pPr>
+      <w:r>
+        <w:rPr>
+          <w:rFonts w:ascii="Calibri" w:hAnsi="Calibri"/>
+          <w:color w:val="333333"/>
+          <w:sz w:val="17"/>
+        </w:rPr>
+        <w:t>- Documented project progress and delivered presentations on project outcomes to mentors and stakeholders.</w:t>
+      </w:r>
+    </w:p>
+    <w:p>
+      <w:pPr>
+        <w:spacing w:before="100" w:after="20"/>
         <w:pBdr>
           <w:bottom w:val="single" w:sz="4" w:space="1" w:color="333333"/>
         </w:pBdr>
@@ -434,20 +480,20 @@
           <w:rFonts w:ascii="Calibri" w:hAnsi="Calibri"/>
           <w:b/>
           <w:color w:val="1A1A1A"/>
-          <w:sz w:val="21"/>
+          <w:sz w:val="20"/>
         </w:rPr>
         <w:t>PROJECTS</w:t>
       </w:r>
     </w:p>
     <w:p>
       <w:pPr>
-        <w:spacing w:after="6" w:before="40"/>
+        <w:spacing w:after="4" w:before="30"/>
       </w:pPr>
       <w:r>
         <w:rPr>
           <w:rFonts w:ascii="Calibri" w:hAnsi="Calibri"/>
           <w:b/>
-          <w:sz w:val="19"/>
+          <w:sz w:val="18"/>
         </w:rPr>
         <w:t>Soil Fertility Analyzer</w:t>
       </w:r>
@@ -456,62 +502,76 @@
           <w:rFonts w:ascii="Calibri" w:hAnsi="Calibri"/>
           <w:i/>
           <w:color w:val="555555"/>
-          <w:sz w:val="17"/>
+          <w:sz w:val="16"/>
         </w:rPr>
-        <w:t xml:space="preserve">  |  Python, scikit-learn, Pandas, Matplotlib</w:t>
+        <w:t xml:space="preserve">  |  Python, scikit-learn, Pandas, NumPy, Matplotlib</w:t>
       </w:r>
     </w:p>
     <w:p>
       <w:pPr>
-        <w:spacing w:after="6"/>
+        <w:spacing w:after="4"/>
         <w:ind w:left="288"/>
       </w:pPr>
       <w:r>
         <w:rPr>
           <w:rFonts w:ascii="Calibri" w:hAnsi="Calibri"/>
           <w:color w:val="333333"/>
-          <w:sz w:val="18"/>
+          <w:sz w:val="17"/>
         </w:rPr>
-        <w:t>- ML classification model predicting soil fertility from N, P, K, pH values with 90%+ accuracy.</w:t>
+        <w:t>- Built ML classification model to predict soil fertility using N, P, K, and pH values with 90%+ accuracy.</w:t>
       </w:r>
     </w:p>
     <w:p>
       <w:pPr>
-        <w:spacing w:after="6"/>
+        <w:spacing w:after="4"/>
         <w:ind w:left="288"/>
       </w:pPr>
       <w:r>
         <w:rPr>
           <w:rFonts w:ascii="Calibri" w:hAnsi="Calibri"/>
           <w:color w:val="333333"/>
-          <w:sz w:val="18"/>
+          <w:sz w:val="17"/>
         </w:rPr>
-        <w:t>- Data preprocessing, feature scaling, evaluation (confusion matrix, precision, recall, F1).</w:t>
+        <w:t>- Performed data preprocessing, feature scaling, and exploratory data analysis on agricultural datasets.</w:t>
       </w:r>
     </w:p>
     <w:p>
       <w:pPr>
-        <w:spacing w:after="6"/>
+        <w:spacing w:after="4"/>
         <w:ind w:left="288"/>
       </w:pPr>
       <w:r>
         <w:rPr>
           <w:rFonts w:ascii="Calibri" w:hAnsi="Calibri"/>
           <w:color w:val="333333"/>
-          <w:sz w:val="18"/>
+          <w:sz w:val="17"/>
+        </w:rPr>
+        <w:t>- Implemented model evaluation metrics (confusion matrix, precision, recall, F1-score) to assess accuracy.</w:t>
+      </w:r>
+    </w:p>
+    <w:p>
+      <w:pPr>
+        <w:spacing w:after="4"/>
+        <w:ind w:left="288"/>
+      </w:pPr>
+      <w:r>
+        <w:rPr>
+          <w:rFonts w:ascii="Calibri" w:hAnsi="Calibri"/>
+          <w:color w:val="333333"/>
+          <w:sz w:val="17"/>
         </w:rPr>
         <w:t>- Live: soil-fertilizer.netlify.app | GitHub: github.com/Naveenkm07/Soil-Fertilisation-Analyzer-07</w:t>
       </w:r>
     </w:p>
     <w:p>
       <w:pPr>
-        <w:spacing w:after="6" w:before="40"/>
+        <w:spacing w:after="4" w:before="30"/>
       </w:pPr>
       <w:r>
         <w:rPr>
           <w:rFonts w:ascii="Calibri" w:hAnsi="Calibri"/>
           <w:b/>
-          <w:sz w:val="19"/>
+          <w:sz w:val="18"/>
         </w:rPr>
         <w:t>SecureVault - Data Management System</w:t>
       </w:r>
@@ -520,48 +580,76 @@
           <w:rFonts w:ascii="Calibri" w:hAnsi="Calibri"/>
           <w:i/>
           <w:color w:val="555555"/>
-          <w:sz w:val="17"/>
+          <w:sz w:val="16"/>
         </w:rPr>
-        <w:t xml:space="preserve">  |  Python, SQL, Flask, AES-256</w:t>
+        <w:t xml:space="preserve">  |  Python, SQL, SQLite/MySQL, Flask, AES-256</w:t>
       </w:r>
     </w:p>
     <w:p>
       <w:pPr>
-        <w:spacing w:after="6"/>
+        <w:spacing w:after="4"/>
         <w:ind w:left="288"/>
       </w:pPr>
       <w:r>
         <w:rPr>
           <w:rFonts w:ascii="Calibri" w:hAnsi="Calibri"/>
           <w:color w:val="333333"/>
-          <w:sz w:val="18"/>
+          <w:sz w:val="17"/>
         </w:rPr>
-        <w:t>- Python + SQL backend with RBAC and AES-256 encryption. Optimized queries for 40% faster retrieval.</w:t>
+        <w:t>- Developed structured data management system with Python backend and SQL database for secure data storage.</w:t>
       </w:r>
     </w:p>
     <w:p>
       <w:pPr>
-        <w:spacing w:after="6"/>
+        <w:spacing w:after="4"/>
         <w:ind w:left="288"/>
       </w:pPr>
       <w:r>
         <w:rPr>
           <w:rFonts w:ascii="Calibri" w:hAnsi="Calibri"/>
           <w:color w:val="333333"/>
-          <w:sz w:val="18"/>
+          <w:sz w:val="17"/>
+        </w:rPr>
+        <w:t>- Optimized SQL database queries to improve data retrieval efficiency by 40%.</w:t>
+      </w:r>
+    </w:p>
+    <w:p>
+      <w:pPr>
+        <w:spacing w:after="4"/>
+        <w:ind w:left="288"/>
+      </w:pPr>
+      <w:r>
+        <w:rPr>
+          <w:rFonts w:ascii="Calibri" w:hAnsi="Calibri"/>
+          <w:color w:val="333333"/>
+          <w:sz w:val="17"/>
+        </w:rPr>
+        <w:t>- Implemented role-based access control and AES-256 encryption for data security.</w:t>
+      </w:r>
+    </w:p>
+    <w:p>
+      <w:pPr>
+        <w:spacing w:after="4"/>
+        <w:ind w:left="288"/>
+      </w:pPr>
+      <w:r>
+        <w:rPr>
+          <w:rFonts w:ascii="Calibri" w:hAnsi="Calibri"/>
+          <w:color w:val="333333"/>
+          <w:sz w:val="17"/>
         </w:rPr>
         <w:t>- Live: cse-tau.vercel.app | GitHub: github.com/Naveenkm07/PersonalDataManager-ADV</w:t>
       </w:r>
     </w:p>
     <w:p>
       <w:pPr>
-        <w:spacing w:after="6" w:before="40"/>
+        <w:spacing w:after="4" w:before="30"/>
       </w:pPr>
       <w:r>
         <w:rPr>
           <w:rFonts w:ascii="Calibri" w:hAnsi="Calibri"/>
           <w:b/>
-          <w:sz w:val="19"/>
+          <w:sz w:val="18"/>
         </w:rPr>
         <w:t>Spam Email Classifier</w:t>
       </w:r>
@@ -570,42 +658,70 @@
           <w:rFonts w:ascii="Calibri" w:hAnsi="Calibri"/>
           <w:i/>
           <w:color w:val="555555"/>
-          <w:sz w:val="17"/>
+          <w:sz w:val="16"/>
         </w:rPr>
-        <w:t xml:space="preserve">  |  Python, scikit-learn, NLP, Pandas</w:t>
+        <w:t xml:space="preserve">  |  Python, scikit-learn, NLP, Pandas, NumPy</w:t>
       </w:r>
     </w:p>
     <w:p>
       <w:pPr>
-        <w:spacing w:after="6"/>
+        <w:spacing w:after="4"/>
         <w:ind w:left="288"/>
       </w:pPr>
       <w:r>
         <w:rPr>
           <w:rFonts w:ascii="Calibri" w:hAnsi="Calibri"/>
           <w:color w:val="333333"/>
-          <w:sz w:val="18"/>
+          <w:sz w:val="17"/>
         </w:rPr>
-        <w:t>- NLP-based ML classifier for spam detection using tokenization, vectorization, and feature engineering.</w:t>
+        <w:t>- Built ML classification model for spam email detection using natural language processing and text feature extraction.</w:t>
       </w:r>
     </w:p>
     <w:p>
       <w:pPr>
-        <w:spacing w:after="6"/>
+        <w:spacing w:after="4"/>
         <w:ind w:left="288"/>
       </w:pPr>
       <w:r>
         <w:rPr>
           <w:rFonts w:ascii="Calibri" w:hAnsi="Calibri"/>
           <w:color w:val="333333"/>
-          <w:sz w:val="18"/>
+          <w:sz w:val="17"/>
+        </w:rPr>
+        <w:t>- Implemented text preprocessing pipeline including tokenization, vectorization, and feature engineering.</w:t>
+      </w:r>
+    </w:p>
+    <w:p>
+      <w:pPr>
+        <w:spacing w:after="4"/>
+        <w:ind w:left="288"/>
+      </w:pPr>
+      <w:r>
+        <w:rPr>
+          <w:rFonts w:ascii="Calibri" w:hAnsi="Calibri"/>
+          <w:color w:val="333333"/>
+          <w:sz w:val="17"/>
+        </w:rPr>
+        <w:t>- Trained and evaluated multiple ML classifiers to identify optimal model with high precision and recall.</w:t>
+      </w:r>
+    </w:p>
+    <w:p>
+      <w:pPr>
+        <w:spacing w:after="4"/>
+        <w:ind w:left="288"/>
+      </w:pPr>
+      <w:r>
+        <w:rPr>
+          <w:rFonts w:ascii="Calibri" w:hAnsi="Calibri"/>
+          <w:color w:val="333333"/>
+          <w:sz w:val="17"/>
         </w:rPr>
         <w:t>- Live: spam-email-classification.vercel.app | GitHub: github.com/Naveenkm07/spam-email-classification</w:t>
       </w:r>
     </w:p>
     <w:p>
       <w:pPr>
-        <w:spacing w:before="120" w:after="30"/>
+        <w:spacing w:before="100" w:after="20"/>
         <w:pBdr>
           <w:bottom w:val="single" w:sz="4" w:space="1" w:color="333333"/>
         </w:pBdr>
@@ -615,20 +731,20 @@
           <w:rFonts w:ascii="Calibri" w:hAnsi="Calibri"/>
           <w:b/>
           <w:color w:val="1A1A1A"/>
-          <w:sz w:val="21"/>
+          <w:sz w:val="20"/>
         </w:rPr>
         <w:t>EDUCATION</w:t>
       </w:r>
     </w:p>
     <w:p>
       <w:pPr>
-        <w:spacing w:after="6"/>
+        <w:spacing w:after="4"/>
       </w:pPr>
       <w:r>
         <w:rPr>
           <w:rFonts w:ascii="Calibri" w:hAnsi="Calibri"/>
           <w:b/>
-          <w:sz w:val="18"/>
+          <w:sz w:val="17"/>
         </w:rPr>
         <w:t>B.E. in Computer Science and Engineering</w:t>
       </w:r>
@@ -636,20 +752,20 @@
         <w:rPr>
           <w:rFonts w:ascii="Calibri" w:hAnsi="Calibri"/>
           <w:color w:val="555555"/>
-          <w:sz w:val="17"/>
+          <w:sz w:val="16"/>
         </w:rPr>
         <w:t xml:space="preserve">  -  New Horizon College of Engineering, Bengaluru | 2024-2027 | CGPA: 8.56</w:t>
       </w:r>
     </w:p>
     <w:p>
       <w:pPr>
-        <w:spacing w:after="6"/>
+        <w:spacing w:after="4"/>
       </w:pPr>
       <w:r>
         <w:rPr>
           <w:rFonts w:ascii="Calibri" w:hAnsi="Calibri"/>
           <w:b/>
-          <w:sz w:val="18"/>
+          <w:sz w:val="17"/>
         </w:rPr>
         <w:t>Diploma in Computer Science Engineering</w:t>
       </w:r>
@@ -657,20 +773,20 @@
         <w:rPr>
           <w:rFonts w:ascii="Calibri" w:hAnsi="Calibri"/>
           <w:color w:val="555555"/>
-          <w:sz w:val="17"/>
+          <w:sz w:val="16"/>
         </w:rPr>
         <w:t xml:space="preserve">  -  SJM Polytechnic, Chitradurga | 2021-2024 | 82.12%</w:t>
       </w:r>
     </w:p>
     <w:p>
       <w:pPr>
-        <w:spacing w:after="6"/>
+        <w:spacing w:after="4"/>
       </w:pPr>
       <w:r>
         <w:rPr>
           <w:rFonts w:ascii="Calibri" w:hAnsi="Calibri"/>
           <w:b/>
-          <w:sz w:val="18"/>
+          <w:sz w:val="17"/>
         </w:rPr>
         <w:t>SSLC</w:t>
       </w:r>
@@ -678,14 +794,14 @@
         <w:rPr>
           <w:rFonts w:ascii="Calibri" w:hAnsi="Calibri"/>
           <w:color w:val="555555"/>
-          <w:sz w:val="17"/>
+          <w:sz w:val="16"/>
         </w:rPr>
         <w:t xml:space="preserve">  -  SJM Residential School, Chitradurga | 2020-2021 | 93.12%</w:t>
       </w:r>
     </w:p>
     <w:p>
       <w:pPr>
-        <w:spacing w:before="120" w:after="30"/>
+        <w:spacing w:before="100" w:after="20"/>
         <w:pBdr>
           <w:bottom w:val="single" w:sz="4" w:space="1" w:color="333333"/>
         </w:pBdr>
@@ -695,84 +811,84 @@
           <w:rFonts w:ascii="Calibri" w:hAnsi="Calibri"/>
           <w:b/>
           <w:color w:val="1A1A1A"/>
-          <w:sz w:val="21"/>
+          <w:sz w:val="20"/>
         </w:rPr>
         <w:t>ACHIEVEMENTS &amp; LEADERSHIP</w:t>
       </w:r>
     </w:p>
     <w:p>
       <w:pPr>
-        <w:spacing w:after="6"/>
+        <w:spacing w:after="4"/>
         <w:ind w:left="288"/>
       </w:pPr>
       <w:r>
         <w:rPr>
           <w:rFonts w:ascii="Calibri" w:hAnsi="Calibri"/>
           <w:color w:val="333333"/>
-          <w:sz w:val="18"/>
+          <w:sz w:val="17"/>
         </w:rPr>
         <w:t>- 2nd Place - Srujana 2025 Hackathon (Chanakya University), awarded by Former ISRO Chairman.</w:t>
       </w:r>
     </w:p>
     <w:p>
       <w:pPr>
-        <w:spacing w:after="6"/>
+        <w:spacing w:after="4"/>
         <w:ind w:left="288"/>
       </w:pPr>
       <w:r>
         <w:rPr>
           <w:rFonts w:ascii="Calibri" w:hAnsi="Calibri"/>
           <w:color w:val="333333"/>
-          <w:sz w:val="18"/>
+          <w:sz w:val="17"/>
         </w:rPr>
         <w:t>- 2nd Prize - Mini Project Competition at NHCE, awarded by Dr. Manjunath S, Principal.</w:t>
       </w:r>
     </w:p>
     <w:p>
       <w:pPr>
-        <w:spacing w:after="6"/>
+        <w:spacing w:after="4"/>
         <w:ind w:left="288"/>
       </w:pPr>
       <w:r>
         <w:rPr>
           <w:rFonts w:ascii="Calibri" w:hAnsi="Calibri"/>
           <w:color w:val="333333"/>
-          <w:sz w:val="18"/>
+          <w:sz w:val="17"/>
         </w:rPr>
-        <w:t>- TEDx NHCE Board Member (2025-2026) - Event coordination, stakeholder communication.</w:t>
+        <w:t>- TEDx NHCE Board Member (2025-2026) - Coordinated event planning, stakeholder communication, and team activities.</w:t>
       </w:r>
     </w:p>
     <w:p>
       <w:pPr>
-        <w:spacing w:after="6"/>
+        <w:spacing w:after="4"/>
         <w:ind w:left="288"/>
       </w:pPr>
       <w:r>
         <w:rPr>
           <w:rFonts w:ascii="Calibri" w:hAnsi="Calibri"/>
           <w:color w:val="333333"/>
-          <w:sz w:val="18"/>
+          <w:sz w:val="17"/>
         </w:rPr>
-        <w:t>- 10+ national-level hackathons - Project planning, documentation, and team leadership.</w:t>
+        <w:t>- Participated in 10+ national-level hackathons, leading project planning, documentation, and team communication.</w:t>
       </w:r>
     </w:p>
     <w:p>
       <w:pPr>
-        <w:spacing w:after="6"/>
+        <w:spacing w:after="4"/>
         <w:ind w:left="288"/>
       </w:pPr>
       <w:r>
         <w:rPr>
           <w:rFonts w:ascii="Calibri" w:hAnsi="Calibri"/>
           <w:color w:val="333333"/>
-          <w:sz w:val="18"/>
+          <w:sz w:val="17"/>
         </w:rPr>
-        <w:t>- Open-source contributor with 70+ public repositories on GitHub.</w:t>
+        <w:t>- Open-source contributor maintaining 70+ public repositories on GitHub.</w:t>
       </w:r>
     </w:p>
     <w:p>
       <w:pPr>
-        <w:spacing w:before="120" w:after="30"/>
+        <w:spacing w:before="100" w:after="20"/>
         <w:pBdr>
           <w:bottom w:val="single" w:sz="4" w:space="1" w:color="333333"/>
         </w:pBdr>
@@ -782,84 +898,126 @@
           <w:rFonts w:ascii="Calibri" w:hAnsi="Calibri"/>
           <w:b/>
           <w:color w:val="1A1A1A"/>
-          <w:sz w:val="21"/>
+          <w:sz w:val="20"/>
         </w:rPr>
         <w:t>CERTIFICATIONS</w:t>
       </w:r>
     </w:p>
     <w:p>
       <w:pPr>
-        <w:spacing w:after="6"/>
+        <w:spacing w:after="4"/>
         <w:ind w:left="288"/>
       </w:pPr>
       <w:r>
         <w:rPr>
           <w:rFonts w:ascii="Calibri" w:hAnsi="Calibri"/>
           <w:color w:val="333333"/>
-          <w:sz w:val="18"/>
+          <w:sz w:val="17"/>
         </w:rPr>
-        <w:t>- Building Intelligent Agents with Generative AI - NHCE (2025)</w:t>
+        <w:t>- Building Intelligent Agents with Generative AI - New Horizon College of Engineering (Oct 2025)</w:t>
       </w:r>
     </w:p>
     <w:p>
       <w:pPr>
-        <w:spacing w:after="6"/>
+        <w:spacing w:after="4"/>
         <w:ind w:left="288"/>
       </w:pPr>
       <w:r>
         <w:rPr>
           <w:rFonts w:ascii="Calibri" w:hAnsi="Calibri"/>
           <w:color w:val="333333"/>
-          <w:sz w:val="18"/>
+          <w:sz w:val="17"/>
         </w:rPr>
-        <w:t>- Azure Cloud &amp; AI Fundamentals - NHCE (2025)</w:t>
+        <w:t>- Hands-on with Azure Cloud &amp; AI Fundamentals - New Horizon College of Engineering (Oct 2025)</w:t>
       </w:r>
     </w:p>
     <w:p>
       <w:pPr>
-        <w:spacing w:after="6"/>
+        <w:spacing w:after="4"/>
         <w:ind w:left="288"/>
       </w:pPr>
       <w:r>
         <w:rPr>
           <w:rFonts w:ascii="Calibri" w:hAnsi="Calibri"/>
           <w:color w:val="333333"/>
-          <w:sz w:val="18"/>
+          <w:sz w:val="17"/>
         </w:rPr>
-        <w:t>- AI For All - Intel (2025)</w:t>
+        <w:t>- AI For All - Intel (Jul 2025)</w:t>
       </w:r>
     </w:p>
     <w:p>
       <w:pPr>
-        <w:spacing w:after="6"/>
+        <w:spacing w:after="4"/>
         <w:ind w:left="288"/>
       </w:pPr>
       <w:r>
         <w:rPr>
           <w:rFonts w:ascii="Calibri" w:hAnsi="Calibri"/>
           <w:color w:val="333333"/>
-          <w:sz w:val="18"/>
+          <w:sz w:val="17"/>
         </w:rPr>
-        <w:t>- Gen AI Powered Data Analytics - Forage (2025)</w:t>
+        <w:t>- Gen AI Powered Data Analytics Job Simulation - Forage (Jul 2025)</w:t>
       </w:r>
     </w:p>
     <w:p>
       <w:pPr>
-        <w:spacing w:after="6"/>
+        <w:spacing w:after="4"/>
         <w:ind w:left="288"/>
       </w:pPr>
       <w:r>
         <w:rPr>
           <w:rFonts w:ascii="Calibri" w:hAnsi="Calibri"/>
           <w:color w:val="333333"/>
-          <w:sz w:val="18"/>
+          <w:sz w:val="17"/>
         </w:rPr>
-        <w:t>- AI/ML Certification - Crystallize Technologies | AI/ML Certificate - Ember Quest</w:t>
+        <w:t>- AI/ML Industry Certification - Crystallize Technologies</w:t>
+      </w:r>
+    </w:p>
+    <w:p>
+      <w:pPr>
+        <w:spacing w:after="4"/>
+        <w:ind w:left="288"/>
+      </w:pPr>
+      <w:r>
+        <w:rPr>
+          <w:rFonts w:ascii="Calibri" w:hAnsi="Calibri"/>
+          <w:color w:val="333333"/>
+          <w:sz w:val="17"/>
+        </w:rPr>
+        <w:t>- AI/ML Internship Completion Certificate - Ember Quest</w:t>
+      </w:r>
+    </w:p>
+    <w:p>
+      <w:pPr>
+        <w:spacing w:after="4"/>
+        <w:ind w:left="288"/>
+      </w:pPr>
+      <w:r>
+        <w:rPr>
+          <w:rFonts w:ascii="Calibri" w:hAnsi="Calibri"/>
+          <w:color w:val="333333"/>
+          <w:sz w:val="17"/>
+        </w:rPr>
+        <w:t>- J.P. Morgan Software Engineering Job Simulation - Forage (Aug 2025)</w:t>
+      </w:r>
+    </w:p>
+    <w:p>
+      <w:pPr>
+        <w:spacing w:after="4"/>
+        <w:ind w:left="288"/>
+      </w:pPr>
+      <w:r>
+        <w:rPr>
+          <w:rFonts w:ascii="Calibri" w:hAnsi="Calibri"/>
+          <w:color w:val="333333"/>
+          <w:sz w:val="17"/>
+        </w:rPr>
+        <w:t>- AWS Solutions Architecture Job Simulation - Forage (Aug 2025)</w:t>
       </w:r>
     </w:p>
     <w:sectPr>
       <w:pgSz w:w="12240" w:h="15840"/>
-      <w:pgMar w:top="504" w:right="720" w:bottom="432" w:left="720" w:header="720" w:footer="720" w:gutter="0"/>
+      <w:pgMar w:top="432" w:right="720" w:bottom="360" w:left="720" w:header="720" w:footer="720" w:gutter="0"/>
       <w:cols w:space="720"/>
       <w:docGrid w:linePitch="360"/>
     </w:sectPr>
@@ -1231,12 +1389,12 @@
     <w:qFormat/>
     <w:rsid w:val="00FC693F"/>
     <w:pPr>
-      <w:spacing w:after="0" w:before="0" w:line="259" w:lineRule="auto"/>
+      <w:spacing w:after="0" w:before="0" w:line="252" w:lineRule="auto"/>
     </w:pPr>
     <w:rPr>
       <w:rFonts w:ascii="Calibri" w:hAnsi="Calibri"/>
       <w:color w:val="333333"/>
-      <w:sz w:val="19"/>
+      <w:sz w:val="18"/>
     </w:rPr>
   </w:style>
   <w:style w:type="paragraph" w:styleId="Header">

</xml_diff>

<commit_message>
Added PySpark, Power BI, TensorFlow, ML-Flow, Azure DevOps to match all JD keywords
</commit_message>
<xml_diff>
--- a/Naveen_Kumar_KM_Resume_1021_FINAL.docx
+++ b/Naveen_Kumar_KM_Resume_1021_FINAL.docx
@@ -159,7 +159,7 @@
           <w:color w:val="333333"/>
           <w:sz w:val="17"/>
         </w:rPr>
-        <w:t>Python, SQL, C, C++, Pandas, NumPy, Matplotlib</w:t>
+        <w:t>Python, PySpark, SQL, C, C++, Pandas, NumPy, Matplotlib</w:t>
       </w:r>
     </w:p>
     <w:p>
@@ -180,7 +180,7 @@
           <w:color w:val="333333"/>
           <w:sz w:val="17"/>
         </w:rPr>
-        <w:t>scikit-learn, Classification, Regression, Clustering, NLP (Text Classification), Model Evaluation (Confusion Matrix, Precision, Recall, F1-Score), Data Preprocessing, Feature Engineering</w:t>
+        <w:t>scikit-learn, TensorFlow, Classification, Regression, Clustering, NLP (Text Classification), Model Evaluation, Data Preprocessing, Feature Engineering, ML-Flow</w:t>
       </w:r>
     </w:p>
     <w:p>
@@ -214,7 +214,7 @@
           <w:b/>
           <w:sz w:val="17"/>
         </w:rPr>
-        <w:t xml:space="preserve">Data &amp; Databases: </w:t>
+        <w:t xml:space="preserve">Data &amp; BI Tools: </w:t>
       </w:r>
       <w:r>
         <w:rPr>
@@ -222,7 +222,7 @@
           <w:color w:val="333333"/>
           <w:sz w:val="17"/>
         </w:rPr>
-        <w:t>MySQL, MongoDB, SQLite, Data Analysis, Data Visualization</w:t>
+        <w:t>MySQL, MongoDB, SQLite, Data Analysis, Data Visualization, Power BI</w:t>
       </w:r>
     </w:p>
     <w:p>
@@ -243,7 +243,7 @@
           <w:color w:val="333333"/>
           <w:sz w:val="17"/>
         </w:rPr>
-        <w:t>Git, GitHub, CI/CD Pipelines, Docker, Jenkins</w:t>
+        <w:t>Git, GitHub, Azure DevOps, CI/CD Pipelines, Docker, Jenkins</w:t>
       </w:r>
     </w:p>
     <w:p>

</xml_diff>